<commit_message>
Week 1 lab updates
</commit_message>
<xml_diff>
--- a/labs/Lab 1.docx
+++ b/labs/Lab 1.docx
@@ -1,6 +1,6 @@
 
 <file path=word/document.xml><?xml version="1.0" encoding="utf-8"?>
-<w:document xmlns:wpc="http://schemas.microsoft.com/office/word/2010/wordprocessingCanvas" xmlns:cx="http://schemas.microsoft.com/office/drawing/2014/chartex" xmlns:cx1="http://schemas.microsoft.com/office/drawing/2015/9/8/chartex" xmlns:cx2="http://schemas.microsoft.com/office/drawing/2015/10/21/chartex" xmlns:cx3="http://schemas.microsoft.com/office/drawing/2016/5/9/chartex" xmlns:cx4="http://schemas.microsoft.com/office/drawing/2016/5/10/chartex" xmlns:cx5="http://schemas.microsoft.com/office/drawing/2016/5/11/chartex" xmlns:cx6="http://schemas.microsoft.com/office/drawing/2016/5/12/chartex" xmlns:cx7="http://schemas.microsoft.com/office/drawing/2016/5/13/chartex" xmlns:cx8="http://schemas.microsoft.com/office/drawing/2016/5/14/chartex" xmlns:mc="http://schemas.openxmlformats.org/markup-compatibility/2006" xmlns:aink="http://schemas.microsoft.com/office/drawing/2016/ink" xmlns:am3d="http://schemas.microsoft.com/office/drawing/2017/model3d" xmlns:o="urn:schemas-microsoft-com:office:office" xmlns:oel="http://schemas.microsoft.com/office/2019/extlst" xmlns:r="http://schemas.openxmlformats.org/officeDocument/2006/relationships" xmlns:m="http://schemas.openxmlformats.org/officeDocument/2006/math" xmlns:v="urn:schemas-microsoft-com:vml" xmlns:wp14="http://schemas.microsoft.com/office/word/2010/wordprocessingDrawing" xmlns:wp="http://schemas.openxmlformats.org/drawingml/2006/wordprocessingDrawing" xmlns:w10="urn:schemas-microsoft-com:office:word" xmlns:w="http://schemas.openxmlformats.org/wordprocessingml/2006/main" xmlns:w14="http://schemas.microsoft.com/office/word/2010/wordml" xmlns:w15="http://schemas.microsoft.com/office/word/2012/wordml" xmlns:w16cex="http://schemas.microsoft.com/office/word/2018/wordml/cex" xmlns:w16cid="http://schemas.microsoft.com/office/word/2016/wordml/cid" xmlns:w16="http://schemas.microsoft.com/office/word/2018/wordml" xmlns:w16du="http://schemas.microsoft.com/office/word/2023/wordml/word16du" xmlns:w16sdtdh="http://schemas.microsoft.com/office/word/2020/wordml/sdtdatahash" xmlns:w16se="http://schemas.microsoft.com/office/word/2015/wordml/symex" xmlns:wpg="http://schemas.microsoft.com/office/word/2010/wordprocessingGroup" xmlns:wpi="http://schemas.microsoft.com/office/word/2010/wordprocessingInk" xmlns:wne="http://schemas.microsoft.com/office/word/2006/wordml" xmlns:wps="http://schemas.microsoft.com/office/word/2010/wordprocessingShape" mc:Ignorable="w14 w15 w16se w16cid w16 w16cex w16sdtdh w16du wp14">
+<w:document xmlns:wpc="http://schemas.microsoft.com/office/word/2010/wordprocessingCanvas" xmlns:cx="http://schemas.microsoft.com/office/drawing/2014/chartex" xmlns:cx1="http://schemas.microsoft.com/office/drawing/2015/9/8/chartex" xmlns:cx2="http://schemas.microsoft.com/office/drawing/2015/10/21/chartex" xmlns:cx3="http://schemas.microsoft.com/office/drawing/2016/5/9/chartex" xmlns:cx4="http://schemas.microsoft.com/office/drawing/2016/5/10/chartex" xmlns:cx5="http://schemas.microsoft.com/office/drawing/2016/5/11/chartex" xmlns:cx6="http://schemas.microsoft.com/office/drawing/2016/5/12/chartex" xmlns:cx7="http://schemas.microsoft.com/office/drawing/2016/5/13/chartex" xmlns:cx8="http://schemas.microsoft.com/office/drawing/2016/5/14/chartex" xmlns:mc="http://schemas.openxmlformats.org/markup-compatibility/2006" xmlns:aink="http://schemas.microsoft.com/office/drawing/2016/ink" xmlns:am3d="http://schemas.microsoft.com/office/drawing/2017/model3d" xmlns:o="urn:schemas-microsoft-com:office:office" xmlns:oel="http://schemas.microsoft.com/office/2019/extlst" xmlns:r="http://schemas.openxmlformats.org/officeDocument/2006/relationships" xmlns:m="http://schemas.openxmlformats.org/officeDocument/2006/math" xmlns:v="urn:schemas-microsoft-com:vml" xmlns:wp14="http://schemas.microsoft.com/office/word/2010/wordprocessingDrawing" xmlns:wp="http://schemas.openxmlformats.org/drawingml/2006/wordprocessingDrawing" xmlns:w10="urn:schemas-microsoft-com:office:word" xmlns:w="http://schemas.openxmlformats.org/wordprocessingml/2006/main" xmlns:w14="http://schemas.microsoft.com/office/word/2010/wordml" xmlns:w15="http://schemas.microsoft.com/office/word/2012/wordml" xmlns:w16cex="http://schemas.microsoft.com/office/word/2018/wordml/cex" xmlns:w16cid="http://schemas.microsoft.com/office/word/2016/wordml/cid" xmlns:w16="http://schemas.microsoft.com/office/word/2018/wordml" xmlns:w16du="http://schemas.microsoft.com/office/word/2023/wordml/word16du" xmlns:w16sdtdh="http://schemas.microsoft.com/office/word/2020/wordml/sdtdatahash" xmlns:w16sdtfl="http://schemas.microsoft.com/office/word/2024/wordml/sdtformatlock" xmlns:w16se="http://schemas.microsoft.com/office/word/2015/wordml/symex" xmlns:wpg="http://schemas.microsoft.com/office/word/2010/wordprocessingGroup" xmlns:wpi="http://schemas.microsoft.com/office/word/2010/wordprocessingInk" xmlns:wne="http://schemas.microsoft.com/office/word/2006/wordml" xmlns:wps="http://schemas.microsoft.com/office/word/2010/wordprocessingShape" mc:Ignorable="w14 w15 w16se w16cid w16 w16cex w16sdtdh w16sdtfl w16du wp14">
   <w:body>
     <w:p>
       <w:pPr>
@@ -34,7 +34,13 @@
         <w:t xml:space="preserve">Lab 1: </w:t>
       </w:r>
       <w:r>
-        <w:t>10/2 and 10/3</w:t>
+        <w:t>9/30</w:t>
+      </w:r>
+      <w:r>
+        <w:t xml:space="preserve"> and 10/</w:t>
+      </w:r>
+      <w:r>
+        <w:t>1</w:t>
       </w:r>
     </w:p>
     <w:p>
@@ -80,15 +86,13 @@
         </w:numPr>
       </w:pPr>
       <w:r>
-        <w:t xml:space="preserve">Ensure everyone has R and </w:t>
-      </w:r>
-      <w:proofErr w:type="spellStart"/>
-      <w:r>
-        <w:t>Rstudio</w:t>
-      </w:r>
-      <w:proofErr w:type="spellEnd"/>
-      <w:r>
-        <w:t xml:space="preserve"> downloaded</w:t>
+        <w:t>Ensure everyone has R and R</w:t>
+      </w:r>
+      <w:r>
+        <w:t>S</w:t>
+      </w:r>
+      <w:r>
+        <w:t>tudio downloaded</w:t>
       </w:r>
     </w:p>
     <w:p>
@@ -112,31 +116,76 @@
         </w:numPr>
       </w:pPr>
       <w:r>
-        <w:t xml:space="preserve">Setup an R project file </w:t>
-      </w:r>
-      <w:proofErr w:type="gramStart"/>
-      <w:r>
-        <w:t xml:space="preserve">on </w:t>
-      </w:r>
-      <w:r>
-        <w:t xml:space="preserve"> your</w:t>
-      </w:r>
-      <w:proofErr w:type="gramEnd"/>
+        <w:t>Set</w:t>
+      </w:r>
       <w:r>
         <w:t xml:space="preserve"> </w:t>
       </w:r>
       <w:r>
+        <w:t xml:space="preserve">up an R project file </w:t>
+      </w:r>
+      <w:r>
+        <w:t>on your</w:t>
+      </w:r>
+      <w:r>
+        <w:t xml:space="preserve"> </w:t>
+      </w:r>
+      <w:r>
         <w:t xml:space="preserve">desktop with </w:t>
       </w:r>
       <w:r>
         <w:rPr>
+          <w:b/>
+          <w:bCs/>
           <w:i/>
           <w:iCs/>
         </w:rPr>
-        <w:t>code, data, tables, figures</w:t>
-      </w:r>
-      <w:r>
-        <w:t xml:space="preserve"> folders</w:t>
+        <w:t>code</w:t>
+      </w:r>
+      <w:r>
+        <w:rPr>
+          <w:i/>
+          <w:iCs/>
+        </w:rPr>
+        <w:t xml:space="preserve">, </w:t>
+      </w:r>
+      <w:r>
+        <w:rPr>
+          <w:b/>
+          <w:bCs/>
+          <w:i/>
+          <w:iCs/>
+        </w:rPr>
+        <w:t>data</w:t>
+      </w:r>
+      <w:r>
+        <w:rPr>
+          <w:i/>
+          <w:iCs/>
+        </w:rPr>
+        <w:t xml:space="preserve">, </w:t>
+      </w:r>
+      <w:r>
+        <w:t xml:space="preserve">and </w:t>
+      </w:r>
+      <w:r>
+        <w:rPr>
+          <w:b/>
+          <w:bCs/>
+          <w:i/>
+          <w:iCs/>
+        </w:rPr>
+        <w:t>output</w:t>
+      </w:r>
+      <w:r>
+        <w:rPr>
+          <w:b/>
+          <w:bCs/>
+        </w:rPr>
+        <w:t xml:space="preserve"> </w:t>
+      </w:r>
+      <w:r>
+        <w:t>folders</w:t>
       </w:r>
     </w:p>
     <w:p>
@@ -154,76 +203,32 @@
         <w:t xml:space="preserve">the </w:t>
       </w:r>
       <w:r>
-        <w:t xml:space="preserve">code folder </w:t>
+        <w:rPr>
+          <w:b/>
+          <w:bCs/>
+          <w:i/>
+          <w:iCs/>
+        </w:rPr>
+        <w:t>code</w:t>
+      </w:r>
+      <w:r>
+        <w:t xml:space="preserve"> folder </w:t>
       </w:r>
     </w:p>
     <w:p>
       <w:pPr>
         <w:pStyle w:val="NoSpacing"/>
-        <w:rPr>
-          <w:b/>
-          <w:bCs/>
-        </w:rPr>
-      </w:pPr>
-      <w:r>
-        <w:rPr>
-          <w:b/>
-          <w:bCs/>
-        </w:rPr>
-        <w:t>Remember to:</w:t>
-      </w:r>
+        <w:ind w:firstLine="360"/>
+        <w:rPr>
+          <w:b/>
+          <w:bCs/>
+        </w:rPr>
+      </w:pPr>
     </w:p>
     <w:p>
       <w:pPr>
         <w:pStyle w:val="NoSpacing"/>
-        <w:numPr>
-          <w:ilvl w:val="0"/>
-          <w:numId w:val="2"/>
-        </w:numPr>
-      </w:pPr>
-      <w:r>
-        <w:t>Work in groups and discuss with your peers as you go.</w:t>
-      </w:r>
-    </w:p>
-    <w:p>
-      <w:pPr>
-        <w:pStyle w:val="NoSpacing"/>
-        <w:numPr>
-          <w:ilvl w:val="0"/>
-          <w:numId w:val="2"/>
-        </w:numPr>
-      </w:pPr>
-      <w:r>
-        <w:t>Write down your questions as and when they arise.</w:t>
-      </w:r>
-    </w:p>
-    <w:p>
-      <w:pPr>
-        <w:pStyle w:val="NoSpacing"/>
-        <w:numPr>
-          <w:ilvl w:val="0"/>
-          <w:numId w:val="2"/>
-        </w:numPr>
-      </w:pPr>
-      <w:r>
-        <w:t>Call for assistance.</w:t>
-      </w:r>
-    </w:p>
-    <w:p>
-      <w:pPr>
-        <w:pStyle w:val="NoSpacing"/>
-        <w:numPr>
-          <w:ilvl w:val="0"/>
-          <w:numId w:val="2"/>
-        </w:numPr>
-      </w:pPr>
-      <w:r>
-        <w:t>Sit near the GE.</w:t>
-      </w:r>
-    </w:p>
-    <w:p>
-      <w:pPr>
-        <w:pStyle w:val="NoSpacing"/>
+        <w:ind w:firstLine="360"/>
       </w:pPr>
       <w:r>
         <w:rPr>
@@ -244,7 +249,87 @@
         </w:r>
       </w:hyperlink>
       <w:r>
-        <w:t xml:space="preserve"> - Modules 1 and 2</w:t>
+        <w:t xml:space="preserve"> - </w:t>
+      </w:r>
+      <w:r>
+        <w:rPr>
+          <w:b/>
+          <w:bCs/>
+        </w:rPr>
+        <w:t>Modules 1 and 2</w:t>
+      </w:r>
+    </w:p>
+    <w:p>
+      <w:pPr>
+        <w:pStyle w:val="NoSpacing"/>
+        <w:rPr>
+          <w:b/>
+          <w:bCs/>
+        </w:rPr>
+      </w:pPr>
+    </w:p>
+    <w:p>
+      <w:pPr>
+        <w:pStyle w:val="NoSpacing"/>
+        <w:rPr>
+          <w:b/>
+          <w:bCs/>
+        </w:rPr>
+      </w:pPr>
+      <w:r>
+        <w:rPr>
+          <w:b/>
+          <w:bCs/>
+        </w:rPr>
+        <w:t>Remember to:</w:t>
+      </w:r>
+    </w:p>
+    <w:p>
+      <w:pPr>
+        <w:pStyle w:val="NoSpacing"/>
+        <w:numPr>
+          <w:ilvl w:val="0"/>
+          <w:numId w:val="2"/>
+        </w:numPr>
+      </w:pPr>
+      <w:r>
+        <w:t>Work in groups and discuss with your peers as you go.</w:t>
+      </w:r>
+    </w:p>
+    <w:p>
+      <w:pPr>
+        <w:pStyle w:val="NoSpacing"/>
+        <w:numPr>
+          <w:ilvl w:val="0"/>
+          <w:numId w:val="2"/>
+        </w:numPr>
+      </w:pPr>
+      <w:r>
+        <w:t>Write down your questions as and when they arise.</w:t>
+      </w:r>
+    </w:p>
+    <w:p>
+      <w:pPr>
+        <w:pStyle w:val="NoSpacing"/>
+        <w:numPr>
+          <w:ilvl w:val="0"/>
+          <w:numId w:val="2"/>
+        </w:numPr>
+      </w:pPr>
+      <w:r>
+        <w:t>Call for assistance.</w:t>
+      </w:r>
+    </w:p>
+    <w:p>
+      <w:pPr>
+        <w:pStyle w:val="NoSpacing"/>
+        <w:numPr>
+          <w:ilvl w:val="0"/>
+          <w:numId w:val="2"/>
+        </w:numPr>
+      </w:pPr>
+      <w:r>
+        <w:t>Sit near the GE.</w:t>
       </w:r>
     </w:p>
     <w:p>
@@ -313,6 +398,10 @@
         </mc:AlternateContent>
       </w:r>
       <w:r>
+        <w:rPr>
+          <w:b/>
+          <w:bCs/>
+        </w:rPr>
         <w:t>Tasks:</w:t>
       </w:r>
     </w:p>
@@ -332,7 +421,13 @@
         <w:t>Install R and RStudio:</w:t>
       </w:r>
       <w:r>
-        <w:t xml:space="preserve"> R is a programming language we use in the class to conduct statistical analysis. RStudio is the application or graphical interface we use to access R. You need both for coding purposes.</w:t>
+        <w:t xml:space="preserve"> R is a programming language </w:t>
+      </w:r>
+      <w:r>
+        <w:t>used</w:t>
+      </w:r>
+      <w:r>
+        <w:t xml:space="preserve"> in the class to conduct statistical analysis. RStudio is the application or graphical interface we use to access R. You need both for coding purposes.</w:t>
       </w:r>
     </w:p>
     <w:p>
@@ -450,13 +545,19 @@
     </w:p>
     <w:p>
       <w:r>
+        <w:rPr>
+          <w:b/>
+          <w:bCs/>
+        </w:rPr>
         <w:t>Note:</w:t>
       </w:r>
       <w:r>
-        <w:t xml:space="preserve"> R and RStudio keep frequent updates (on an annual basis). You should re-install them to have the most up-to-date version.</w:t>
-      </w:r>
-    </w:p>
-    <w:p/>
+        <w:t xml:space="preserve"> R </w:t>
+      </w:r>
+      <w:r>
+        <w:t>and RStudio are updated periodically, so your version may look slightly different from the screenshots used in this course. This is usually okay.</w:t>
+      </w:r>
+    </w:p>
     <w:p>
       <w:pPr>
         <w:pStyle w:val="ListParagraph"/>
@@ -470,24 +571,21 @@
           <w:b/>
           <w:bCs/>
         </w:rPr>
+        <w:t>RStudio:</w:t>
+      </w:r>
+      <w:r>
+        <w:t xml:space="preserve"> </w:t>
+      </w:r>
+      <w:r>
+        <w:t xml:space="preserve">RStudio is an interface for using the R programming language. Once you open RStudio, click on File -&gt; New File -&gt; R Script to see four panes. This interface is similar to Word, so file and save are intuitive to you. </w:t>
+      </w:r>
+    </w:p>
+    <w:p>
+      <w:r>
+        <w:rPr>
+          <w:noProof/>
+        </w:rPr>
         <w:lastRenderedPageBreak/>
-        <w:t>RStudio:</w:t>
-      </w:r>
-      <w:r>
-        <w:t xml:space="preserve"> RStudio is an interface to use the R programming language.</w:t>
-      </w:r>
-      <w:r>
-        <w:t xml:space="preserve"> Once you open RStudio Click on File -&gt; New File -&gt; R Script to see</w:t>
-      </w:r>
-      <w:r>
-        <w:t xml:space="preserve"> four panes. </w:t>
-      </w:r>
-    </w:p>
-    <w:p>
-      <w:r>
-        <w:rPr>
-          <w:noProof/>
-        </w:rPr>
         <w:drawing>
           <wp:inline distT="0" distB="0" distL="0" distR="0" wp14:anchorId="03928FA7" wp14:editId="4B0446C8">
             <wp:extent cx="5354469" cy="2926080"/>
@@ -531,6 +629,439 @@
         </w:drawing>
       </w:r>
     </w:p>
+    <w:tbl>
+      <w:tblPr>
+        <w:tblW w:w="5000" w:type="pct"/>
+        <w:tblBorders>
+          <w:top w:val="single" w:sz="6" w:space="0" w:color="auto"/>
+          <w:left w:val="single" w:sz="6" w:space="0" w:color="auto"/>
+          <w:bottom w:val="single" w:sz="6" w:space="0" w:color="auto"/>
+          <w:right w:val="single" w:sz="6" w:space="0" w:color="auto"/>
+        </w:tblBorders>
+        <w:tblCellMar>
+          <w:top w:w="160" w:type="dxa"/>
+          <w:left w:w="160" w:type="dxa"/>
+          <w:bottom w:w="160" w:type="dxa"/>
+          <w:right w:w="160" w:type="dxa"/>
+        </w:tblCellMar>
+        <w:tblLook w:val="04A0" w:firstRow="1" w:lastRow="0" w:firstColumn="1" w:lastColumn="0" w:noHBand="0" w:noVBand="1"/>
+      </w:tblPr>
+      <w:tblGrid>
+        <w:gridCol w:w="3261"/>
+        <w:gridCol w:w="6803"/>
+      </w:tblGrid>
+      <w:tr>
+        <w:trPr>
+          <w:tblHeader/>
+        </w:trPr>
+        <w:tc>
+          <w:tcPr>
+            <w:tcW w:w="0" w:type="auto"/>
+            <w:tcBorders>
+              <w:top w:val="single" w:sz="6" w:space="0" w:color="auto"/>
+              <w:left w:val="single" w:sz="6" w:space="0" w:color="auto"/>
+              <w:bottom w:val="single" w:sz="6" w:space="0" w:color="auto"/>
+              <w:right w:val="single" w:sz="6" w:space="0" w:color="auto"/>
+            </w:tcBorders>
+            <w:noWrap/>
+            <w:tcMar>
+              <w:top w:w="120" w:type="dxa"/>
+              <w:left w:w="180" w:type="dxa"/>
+              <w:bottom w:w="120" w:type="dxa"/>
+              <w:right w:w="180" w:type="dxa"/>
+            </w:tcMar>
+            <w:vAlign w:val="center"/>
+            <w:hideMark/>
+          </w:tcPr>
+          <w:p>
+            <w:pPr>
+              <w:spacing w:before="100" w:beforeAutospacing="1" w:after="100" w:afterAutospacing="1" w:line="240" w:lineRule="auto"/>
+              <w:jc w:val="center"/>
+              <w:rPr>
+                <w:rFonts w:ascii="Times New Roman" w:eastAsia="Times New Roman" w:hAnsi="Times New Roman" w:cs="Times New Roman"/>
+                <w:b/>
+                <w:bCs/>
+                <w:sz w:val="24"/>
+                <w:szCs w:val="24"/>
+              </w:rPr>
+            </w:pPr>
+            <w:r>
+              <w:rPr>
+                <w:rFonts w:ascii="Times New Roman" w:eastAsia="Times New Roman" w:hAnsi="Times New Roman" w:cs="Times New Roman"/>
+                <w:b/>
+                <w:bCs/>
+                <w:sz w:val="24"/>
+                <w:szCs w:val="24"/>
+              </w:rPr>
+              <w:t>Pane</w:t>
+            </w:r>
+          </w:p>
+        </w:tc>
+        <w:tc>
+          <w:tcPr>
+            <w:tcW w:w="0" w:type="auto"/>
+            <w:tcBorders>
+              <w:top w:val="single" w:sz="6" w:space="0" w:color="auto"/>
+              <w:left w:val="single" w:sz="6" w:space="0" w:color="auto"/>
+              <w:bottom w:val="single" w:sz="6" w:space="0" w:color="auto"/>
+              <w:right w:val="single" w:sz="6" w:space="0" w:color="auto"/>
+            </w:tcBorders>
+            <w:noWrap/>
+            <w:tcMar>
+              <w:top w:w="120" w:type="dxa"/>
+              <w:left w:w="180" w:type="dxa"/>
+              <w:bottom w:w="120" w:type="dxa"/>
+              <w:right w:w="180" w:type="dxa"/>
+            </w:tcMar>
+            <w:vAlign w:val="center"/>
+            <w:hideMark/>
+          </w:tcPr>
+          <w:p>
+            <w:pPr>
+              <w:spacing w:before="100" w:beforeAutospacing="1" w:after="100" w:afterAutospacing="1" w:line="240" w:lineRule="auto"/>
+              <w:jc w:val="center"/>
+              <w:rPr>
+                <w:rFonts w:ascii="Times New Roman" w:eastAsia="Times New Roman" w:hAnsi="Times New Roman" w:cs="Times New Roman"/>
+                <w:b/>
+                <w:bCs/>
+                <w:sz w:val="24"/>
+                <w:szCs w:val="24"/>
+              </w:rPr>
+            </w:pPr>
+            <w:r>
+              <w:rPr>
+                <w:rFonts w:ascii="Times New Roman" w:eastAsia="Times New Roman" w:hAnsi="Times New Roman" w:cs="Times New Roman"/>
+                <w:b/>
+                <w:bCs/>
+                <w:sz w:val="24"/>
+                <w:szCs w:val="24"/>
+              </w:rPr>
+              <w:t>What we’ll use it for</w:t>
+            </w:r>
+          </w:p>
+        </w:tc>
+      </w:tr>
+      <w:tr>
+        <w:tc>
+          <w:tcPr>
+            <w:tcW w:w="0" w:type="auto"/>
+            <w:tcBorders>
+              <w:top w:val="single" w:sz="6" w:space="0" w:color="auto"/>
+              <w:left w:val="single" w:sz="6" w:space="0" w:color="auto"/>
+              <w:bottom w:val="single" w:sz="6" w:space="0" w:color="auto"/>
+              <w:right w:val="single" w:sz="6" w:space="0" w:color="auto"/>
+            </w:tcBorders>
+            <w:noWrap/>
+            <w:tcMar>
+              <w:top w:w="120" w:type="dxa"/>
+              <w:left w:w="180" w:type="dxa"/>
+              <w:bottom w:w="120" w:type="dxa"/>
+              <w:right w:w="180" w:type="dxa"/>
+            </w:tcMar>
+            <w:vAlign w:val="center"/>
+            <w:hideMark/>
+          </w:tcPr>
+          <w:p>
+            <w:pPr>
+              <w:spacing w:before="100" w:beforeAutospacing="1" w:after="100" w:afterAutospacing="1" w:line="240" w:lineRule="auto"/>
+              <w:rPr>
+                <w:rFonts w:ascii="Times New Roman" w:eastAsia="Times New Roman" w:hAnsi="Times New Roman" w:cs="Times New Roman"/>
+                <w:sz w:val="24"/>
+                <w:szCs w:val="24"/>
+              </w:rPr>
+            </w:pPr>
+            <w:r>
+              <w:rPr>
+                <w:rFonts w:ascii="Times New Roman" w:eastAsia="Times New Roman" w:hAnsi="Times New Roman" w:cs="Times New Roman"/>
+                <w:b/>
+                <w:bCs/>
+                <w:sz w:val="24"/>
+                <w:szCs w:val="24"/>
+              </w:rPr>
+              <w:t>Source</w:t>
+            </w:r>
+          </w:p>
+        </w:tc>
+        <w:tc>
+          <w:tcPr>
+            <w:tcW w:w="0" w:type="auto"/>
+            <w:tcBorders>
+              <w:top w:val="single" w:sz="6" w:space="0" w:color="auto"/>
+              <w:left w:val="single" w:sz="6" w:space="0" w:color="auto"/>
+              <w:bottom w:val="single" w:sz="6" w:space="0" w:color="auto"/>
+              <w:right w:val="single" w:sz="6" w:space="0" w:color="auto"/>
+            </w:tcBorders>
+            <w:noWrap/>
+            <w:tcMar>
+              <w:top w:w="120" w:type="dxa"/>
+              <w:left w:w="180" w:type="dxa"/>
+              <w:bottom w:w="120" w:type="dxa"/>
+              <w:right w:w="180" w:type="dxa"/>
+            </w:tcMar>
+            <w:vAlign w:val="center"/>
+            <w:hideMark/>
+          </w:tcPr>
+          <w:p>
+            <w:pPr>
+              <w:spacing w:before="100" w:beforeAutospacing="1" w:after="100" w:afterAutospacing="1" w:line="240" w:lineRule="auto"/>
+              <w:rPr>
+                <w:rFonts w:ascii="Times New Roman" w:eastAsia="Times New Roman" w:hAnsi="Times New Roman" w:cs="Times New Roman"/>
+                <w:sz w:val="24"/>
+                <w:szCs w:val="24"/>
+              </w:rPr>
+            </w:pPr>
+            <w:r>
+              <w:rPr>
+                <w:rFonts w:ascii="Times New Roman" w:eastAsia="Times New Roman" w:hAnsi="Times New Roman" w:cs="Times New Roman"/>
+                <w:sz w:val="24"/>
+                <w:szCs w:val="24"/>
+              </w:rPr>
+              <w:t>Write and save R code</w:t>
+            </w:r>
+          </w:p>
+        </w:tc>
+      </w:tr>
+      <w:tr>
+        <w:tc>
+          <w:tcPr>
+            <w:tcW w:w="0" w:type="auto"/>
+            <w:tcBorders>
+              <w:top w:val="single" w:sz="6" w:space="0" w:color="auto"/>
+              <w:left w:val="single" w:sz="6" w:space="0" w:color="auto"/>
+              <w:bottom w:val="single" w:sz="6" w:space="0" w:color="auto"/>
+              <w:right w:val="single" w:sz="6" w:space="0" w:color="auto"/>
+            </w:tcBorders>
+            <w:noWrap/>
+            <w:tcMar>
+              <w:top w:w="120" w:type="dxa"/>
+              <w:left w:w="180" w:type="dxa"/>
+              <w:bottom w:w="120" w:type="dxa"/>
+              <w:right w:w="180" w:type="dxa"/>
+            </w:tcMar>
+            <w:vAlign w:val="center"/>
+            <w:hideMark/>
+          </w:tcPr>
+          <w:p>
+            <w:pPr>
+              <w:spacing w:before="100" w:beforeAutospacing="1" w:after="100" w:afterAutospacing="1" w:line="240" w:lineRule="auto"/>
+              <w:rPr>
+                <w:rFonts w:ascii="Times New Roman" w:eastAsia="Times New Roman" w:hAnsi="Times New Roman" w:cs="Times New Roman"/>
+                <w:sz w:val="24"/>
+                <w:szCs w:val="24"/>
+              </w:rPr>
+            </w:pPr>
+            <w:r>
+              <w:rPr>
+                <w:rFonts w:ascii="Times New Roman" w:eastAsia="Times New Roman" w:hAnsi="Times New Roman" w:cs="Times New Roman"/>
+                <w:b/>
+                <w:bCs/>
+                <w:sz w:val="24"/>
+                <w:szCs w:val="24"/>
+              </w:rPr>
+              <w:t>Console</w:t>
+            </w:r>
+          </w:p>
+        </w:tc>
+        <w:tc>
+          <w:tcPr>
+            <w:tcW w:w="0" w:type="auto"/>
+            <w:tcBorders>
+              <w:top w:val="single" w:sz="6" w:space="0" w:color="auto"/>
+              <w:left w:val="single" w:sz="6" w:space="0" w:color="auto"/>
+              <w:bottom w:val="single" w:sz="6" w:space="0" w:color="auto"/>
+              <w:right w:val="single" w:sz="6" w:space="0" w:color="auto"/>
+            </w:tcBorders>
+            <w:noWrap/>
+            <w:tcMar>
+              <w:top w:w="120" w:type="dxa"/>
+              <w:left w:w="180" w:type="dxa"/>
+              <w:bottom w:w="120" w:type="dxa"/>
+              <w:right w:w="180" w:type="dxa"/>
+            </w:tcMar>
+            <w:vAlign w:val="center"/>
+            <w:hideMark/>
+          </w:tcPr>
+          <w:p>
+            <w:pPr>
+              <w:spacing w:before="100" w:beforeAutospacing="1" w:after="100" w:afterAutospacing="1" w:line="240" w:lineRule="auto"/>
+              <w:rPr>
+                <w:rFonts w:ascii="Times New Roman" w:eastAsia="Times New Roman" w:hAnsi="Times New Roman" w:cs="Times New Roman"/>
+                <w:sz w:val="24"/>
+                <w:szCs w:val="24"/>
+              </w:rPr>
+            </w:pPr>
+            <w:r>
+              <w:rPr>
+                <w:rFonts w:ascii="Times New Roman" w:eastAsia="Times New Roman" w:hAnsi="Times New Roman" w:cs="Times New Roman"/>
+                <w:sz w:val="24"/>
+                <w:szCs w:val="24"/>
+              </w:rPr>
+              <w:t>Where R executes commands and displays output</w:t>
+            </w:r>
+          </w:p>
+        </w:tc>
+      </w:tr>
+      <w:tr>
+        <w:tc>
+          <w:tcPr>
+            <w:tcW w:w="0" w:type="auto"/>
+            <w:tcBorders>
+              <w:top w:val="single" w:sz="6" w:space="0" w:color="auto"/>
+              <w:left w:val="single" w:sz="6" w:space="0" w:color="auto"/>
+              <w:bottom w:val="single" w:sz="6" w:space="0" w:color="auto"/>
+              <w:right w:val="single" w:sz="6" w:space="0" w:color="auto"/>
+            </w:tcBorders>
+            <w:noWrap/>
+            <w:tcMar>
+              <w:top w:w="120" w:type="dxa"/>
+              <w:left w:w="180" w:type="dxa"/>
+              <w:bottom w:w="120" w:type="dxa"/>
+              <w:right w:w="180" w:type="dxa"/>
+            </w:tcMar>
+            <w:vAlign w:val="center"/>
+            <w:hideMark/>
+          </w:tcPr>
+          <w:p>
+            <w:pPr>
+              <w:spacing w:before="100" w:beforeAutospacing="1" w:after="100" w:afterAutospacing="1" w:line="240" w:lineRule="auto"/>
+              <w:rPr>
+                <w:rFonts w:ascii="Times New Roman" w:eastAsia="Times New Roman" w:hAnsi="Times New Roman" w:cs="Times New Roman"/>
+                <w:sz w:val="24"/>
+                <w:szCs w:val="24"/>
+              </w:rPr>
+            </w:pPr>
+            <w:r>
+              <w:rPr>
+                <w:rFonts w:ascii="Times New Roman" w:eastAsia="Times New Roman" w:hAnsi="Times New Roman" w:cs="Times New Roman"/>
+                <w:b/>
+                <w:bCs/>
+                <w:sz w:val="24"/>
+                <w:szCs w:val="24"/>
+              </w:rPr>
+              <w:t>Environment/History</w:t>
+            </w:r>
+          </w:p>
+        </w:tc>
+        <w:tc>
+          <w:tcPr>
+            <w:tcW w:w="0" w:type="auto"/>
+            <w:tcBorders>
+              <w:top w:val="single" w:sz="6" w:space="0" w:color="auto"/>
+              <w:left w:val="single" w:sz="6" w:space="0" w:color="auto"/>
+              <w:bottom w:val="single" w:sz="6" w:space="0" w:color="auto"/>
+              <w:right w:val="single" w:sz="6" w:space="0" w:color="auto"/>
+            </w:tcBorders>
+            <w:noWrap/>
+            <w:tcMar>
+              <w:top w:w="120" w:type="dxa"/>
+              <w:left w:w="180" w:type="dxa"/>
+              <w:bottom w:w="120" w:type="dxa"/>
+              <w:right w:w="180" w:type="dxa"/>
+            </w:tcMar>
+            <w:vAlign w:val="center"/>
+            <w:hideMark/>
+          </w:tcPr>
+          <w:p>
+            <w:pPr>
+              <w:spacing w:before="100" w:beforeAutospacing="1" w:after="100" w:afterAutospacing="1" w:line="240" w:lineRule="auto"/>
+              <w:rPr>
+                <w:rFonts w:ascii="Times New Roman" w:eastAsia="Times New Roman" w:hAnsi="Times New Roman" w:cs="Times New Roman"/>
+                <w:sz w:val="24"/>
+                <w:szCs w:val="24"/>
+              </w:rPr>
+            </w:pPr>
+            <w:r>
+              <w:rPr>
+                <w:rFonts w:ascii="Times New Roman" w:eastAsia="Times New Roman" w:hAnsi="Times New Roman" w:cs="Times New Roman"/>
+                <w:sz w:val="24"/>
+                <w:szCs w:val="24"/>
+              </w:rPr>
+              <w:t>See objects we’ve created and command history</w:t>
+            </w:r>
+          </w:p>
+        </w:tc>
+      </w:tr>
+      <w:tr>
+        <w:tc>
+          <w:tcPr>
+            <w:tcW w:w="0" w:type="auto"/>
+            <w:tcBorders>
+              <w:top w:val="single" w:sz="6" w:space="0" w:color="auto"/>
+              <w:left w:val="single" w:sz="6" w:space="0" w:color="auto"/>
+              <w:bottom w:val="single" w:sz="6" w:space="0" w:color="auto"/>
+              <w:right w:val="single" w:sz="6" w:space="0" w:color="auto"/>
+            </w:tcBorders>
+            <w:noWrap/>
+            <w:tcMar>
+              <w:top w:w="120" w:type="dxa"/>
+              <w:left w:w="180" w:type="dxa"/>
+              <w:bottom w:w="120" w:type="dxa"/>
+              <w:right w:w="180" w:type="dxa"/>
+            </w:tcMar>
+            <w:vAlign w:val="center"/>
+            <w:hideMark/>
+          </w:tcPr>
+          <w:p>
+            <w:pPr>
+              <w:spacing w:before="100" w:beforeAutospacing="1" w:after="100" w:afterAutospacing="1" w:line="240" w:lineRule="auto"/>
+              <w:rPr>
+                <w:rFonts w:ascii="Times New Roman" w:eastAsia="Times New Roman" w:hAnsi="Times New Roman" w:cs="Times New Roman"/>
+                <w:sz w:val="24"/>
+                <w:szCs w:val="24"/>
+              </w:rPr>
+            </w:pPr>
+            <w:r>
+              <w:rPr>
+                <w:rFonts w:ascii="Times New Roman" w:eastAsia="Times New Roman" w:hAnsi="Times New Roman" w:cs="Times New Roman"/>
+                <w:b/>
+                <w:bCs/>
+                <w:sz w:val="24"/>
+                <w:szCs w:val="24"/>
+              </w:rPr>
+              <w:t>Files/Plots/Packages/Help</w:t>
+            </w:r>
+          </w:p>
+        </w:tc>
+        <w:tc>
+          <w:tcPr>
+            <w:tcW w:w="0" w:type="auto"/>
+            <w:tcBorders>
+              <w:top w:val="single" w:sz="6" w:space="0" w:color="auto"/>
+              <w:left w:val="single" w:sz="6" w:space="0" w:color="auto"/>
+              <w:bottom w:val="single" w:sz="6" w:space="0" w:color="auto"/>
+              <w:right w:val="single" w:sz="6" w:space="0" w:color="auto"/>
+            </w:tcBorders>
+            <w:noWrap/>
+            <w:tcMar>
+              <w:top w:w="120" w:type="dxa"/>
+              <w:left w:w="180" w:type="dxa"/>
+              <w:bottom w:w="120" w:type="dxa"/>
+              <w:right w:w="180" w:type="dxa"/>
+            </w:tcMar>
+            <w:vAlign w:val="center"/>
+            <w:hideMark/>
+          </w:tcPr>
+          <w:p>
+            <w:pPr>
+              <w:spacing w:before="100" w:beforeAutospacing="1" w:after="100" w:afterAutospacing="1" w:line="240" w:lineRule="auto"/>
+              <w:rPr>
+                <w:rFonts w:ascii="Times New Roman" w:eastAsia="Times New Roman" w:hAnsi="Times New Roman" w:cs="Times New Roman"/>
+                <w:sz w:val="24"/>
+                <w:szCs w:val="24"/>
+              </w:rPr>
+            </w:pPr>
+            <w:r>
+              <w:rPr>
+                <w:rFonts w:ascii="Times New Roman" w:eastAsia="Times New Roman" w:hAnsi="Times New Roman" w:cs="Times New Roman"/>
+                <w:sz w:val="24"/>
+                <w:szCs w:val="24"/>
+              </w:rPr>
+              <w:t>Navigate files, view plots, manage packages, and access help</w:t>
+            </w:r>
+          </w:p>
+        </w:tc>
+      </w:tr>
+    </w:tbl>
     <w:p/>
     <w:p>
       <w:pPr>
@@ -588,47 +1119,18 @@
         <w:t>educ641</w:t>
       </w:r>
       <w:r>
-        <w:t xml:space="preserve"> course. Then create a folder titled </w:t>
-      </w:r>
-      <w:r>
-        <w:rPr>
-          <w:b/>
-          <w:bCs/>
-        </w:rPr>
-        <w:t>educ641_labs</w:t>
-      </w:r>
-      <w:r>
-        <w:t xml:space="preserve"> and </w:t>
-      </w:r>
-      <w:r>
-        <w:rPr>
-          <w:b/>
-          <w:bCs/>
-        </w:rPr>
-        <w:t>educ641_hw</w:t>
-      </w:r>
-    </w:p>
-    <w:p>
-      <w:pPr>
-        <w:pStyle w:val="ListParagraph"/>
-        <w:ind w:left="1440"/>
-        <w:rPr>
-          <w:b/>
-          <w:bCs/>
-        </w:rPr>
-      </w:pPr>
-      <w:r>
-        <w:rPr>
-          <w:b/>
-          <w:bCs/>
+        <w:t xml:space="preserve"> course. </w:t>
+      </w:r>
+      <w:r>
+        <w:rPr>
           <w:noProof/>
           <w14:ligatures w14:val="standardContextual"/>
         </w:rPr>
         <w:drawing>
-          <wp:inline distT="0" distB="0" distL="0" distR="0" wp14:anchorId="096566DC" wp14:editId="58058214">
-            <wp:extent cx="3657600" cy="1568546"/>
-            <wp:effectExtent l="0" t="0" r="0" b="6350"/>
-            <wp:docPr id="1208838835" name="Picture 2"/>
+          <wp:inline distT="0" distB="0" distL="0" distR="0" wp14:anchorId="138840FE" wp14:editId="34379C3F">
+            <wp:extent cx="3548270" cy="2182034"/>
+            <wp:effectExtent l="0" t="0" r="0" b="2540"/>
+            <wp:docPr id="866410572" name="Picture 2" descr="A screenshot of a computer&#10;&#10;AI-generated content may be incorrect."/>
             <wp:cNvGraphicFramePr>
               <a:graphicFrameLocks xmlns:a="http://schemas.openxmlformats.org/drawingml/2006/main" noChangeAspect="1"/>
             </wp:cNvGraphicFramePr>
@@ -636,7 +1138,7 @@
               <a:graphicData uri="http://schemas.openxmlformats.org/drawingml/2006/picture">
                 <pic:pic xmlns:pic="http://schemas.openxmlformats.org/drawingml/2006/picture">
                   <pic:nvPicPr>
-                    <pic:cNvPr id="1208838835" name="Picture 1208838835"/>
+                    <pic:cNvPr id="866410572" name="Picture 2" descr="A screenshot of a computer&#10;&#10;AI-generated content may be incorrect."/>
                     <pic:cNvPicPr/>
                   </pic:nvPicPr>
                   <pic:blipFill>
@@ -654,7 +1156,7 @@
                   <pic:spPr>
                     <a:xfrm>
                       <a:off x="0" y="0"/>
-                      <a:ext cx="3657600" cy="1568546"/>
+                      <a:ext cx="3642708" cy="2240109"/>
                     </a:xfrm>
                     <a:prstGeom prst="rect">
                       <a:avLst/>
@@ -671,23 +1173,393 @@
       <w:pPr>
         <w:pStyle w:val="ListParagraph"/>
         <w:ind w:left="1440"/>
-        <w:rPr>
-          <w:b/>
-          <w:bCs/>
-        </w:rPr>
-      </w:pPr>
-      <w:r>
-        <w:rPr>
-          <w:b/>
-          <w:bCs/>
+      </w:pPr>
+    </w:p>
+    <w:p>
+      <w:pPr>
+        <w:pStyle w:val="ListParagraph"/>
+        <w:numPr>
+          <w:ilvl w:val="1"/>
+          <w:numId w:val="4"/>
+        </w:numPr>
+      </w:pPr>
+      <w:r>
+        <w:t>Then, inside your _R folder, a</w:t>
+      </w:r>
+      <w:r>
+        <w:t xml:space="preserve">dd </w:t>
+      </w:r>
+      <w:r>
+        <w:t>four</w:t>
+      </w:r>
+      <w:r>
+        <w:t xml:space="preserve"> </w:t>
+      </w:r>
+      <w:r>
+        <w:t xml:space="preserve">more folders </w:t>
+      </w:r>
+      <w:r>
+        <w:t>and</w:t>
+      </w:r>
+      <w:r>
+        <w:t xml:space="preserve"> label them </w:t>
+      </w:r>
+      <w:r>
+        <w:rPr>
+          <w:i/>
+          <w:iCs/>
+        </w:rPr>
+        <w:t>'code', 'data',</w:t>
+      </w:r>
+      <w:r>
+        <w:rPr>
+          <w:i/>
+          <w:iCs/>
+        </w:rPr>
+        <w:t xml:space="preserve"> ‘tables',</w:t>
+      </w:r>
+      <w:r>
+        <w:rPr>
+          <w:i/>
+          <w:iCs/>
+        </w:rPr>
+        <w:t xml:space="preserve"> </w:t>
+      </w:r>
+      <w:r>
+        <w:t>and</w:t>
+      </w:r>
+      <w:r>
+        <w:rPr>
+          <w:i/>
+          <w:iCs/>
+        </w:rPr>
+        <w:t xml:space="preserve"> '</w:t>
+      </w:r>
+      <w:r>
+        <w:rPr>
+          <w:i/>
+          <w:iCs/>
+        </w:rPr>
+        <w:t>figures</w:t>
+      </w:r>
+      <w:r>
+        <w:rPr>
+          <w:i/>
+          <w:iCs/>
+        </w:rPr>
+        <w:t>'.</w:t>
+      </w:r>
+      <w:r>
+        <w:rPr>
+          <w:i/>
+          <w:iCs/>
+        </w:rPr>
+        <w:t xml:space="preserve"> </w:t>
+      </w:r>
+    </w:p>
+    <w:p>
+      <w:pPr>
+        <w:ind w:left="1080"/>
+      </w:pPr>
+      <w:r>
+        <w:rPr>
+          <w:b/>
+          <w:bCs/>
+          <w:i/>
+          <w:iCs/>
+        </w:rPr>
+        <w:lastRenderedPageBreak/>
+        <w:t xml:space="preserve">Note: </w:t>
+      </w:r>
+      <w:r>
+        <w:t xml:space="preserve">Throughout this course, </w:t>
+      </w:r>
+      <w:r>
+        <w:rPr>
+          <w:highlight w:val="yellow"/>
+        </w:rPr>
+        <w:t xml:space="preserve">use lowercase names and avoid spaces in </w:t>
+      </w:r>
+      <w:r>
+        <w:rPr>
+          <w:b/>
+          <w:bCs/>
+          <w:i/>
+          <w:iCs/>
+          <w:highlight w:val="yellow"/>
+        </w:rPr>
+        <w:t>file and folder</w:t>
+      </w:r>
+      <w:r>
+        <w:t xml:space="preserve"> names. Instead of spaces, use underscores (_). This makes file paths easier to work with and helps prevent avoidable coding errors.</w:t>
+      </w:r>
+    </w:p>
+    <w:p>
+      <w:r>
+        <w:rPr>
+          <w:b/>
+          <w:bCs/>
+        </w:rPr>
+        <w:t>Example:</w:t>
+      </w:r>
+    </w:p>
+    <w:p>
+      <w:pPr>
+        <w:pStyle w:val="SourceCode"/>
+        <w:rPr>
+          <w:rStyle w:val="NormalTok"/>
+          <w:rFonts w:asciiTheme="majorHAnsi" w:hAnsiTheme="majorHAnsi" w:cstheme="majorBidi"/>
+          <w:b/>
+          <w:bCs/>
+        </w:rPr>
+      </w:pPr>
+      <w:r>
+        <w:rPr>
+          <w:rStyle w:val="NormalTok"/>
+          <w:rFonts w:asciiTheme="majorHAnsi" w:hAnsiTheme="majorHAnsi" w:cstheme="majorBidi"/>
+          <w:b/>
+          <w:bCs/>
+        </w:rPr>
+        <w:t xml:space="preserve">Good: </w:t>
+      </w:r>
+      <w:r>
+        <w:rPr>
+          <w:rStyle w:val="NormalTok"/>
+          <w:rFonts w:asciiTheme="majorHAnsi" w:hAnsiTheme="majorHAnsi" w:cstheme="majorBidi"/>
+          <w:b/>
+          <w:bCs/>
+        </w:rPr>
+        <w:tab/>
+      </w:r>
+      <w:r>
+        <w:rPr>
+          <w:rStyle w:val="NormalTok"/>
+          <w:rFonts w:asciiTheme="majorHAnsi" w:hAnsiTheme="majorHAnsi" w:cstheme="majorBidi"/>
+        </w:rPr>
+        <w:t>educ641_lab2.R</w:t>
+      </w:r>
+    </w:p>
+    <w:p>
+      <w:pPr>
+        <w:pStyle w:val="SourceCode"/>
+        <w:rPr>
+          <w:rStyle w:val="NormalTok"/>
+          <w:rFonts w:asciiTheme="majorHAnsi" w:hAnsiTheme="majorHAnsi" w:cstheme="majorBidi"/>
+          <w:b/>
+          <w:bCs/>
+        </w:rPr>
+      </w:pPr>
+      <w:r>
+        <w:rPr>
+          <w:rStyle w:val="NormalTok"/>
+          <w:rFonts w:asciiTheme="majorHAnsi" w:hAnsiTheme="majorHAnsi" w:cstheme="majorBidi"/>
+          <w:b/>
+          <w:bCs/>
+        </w:rPr>
+        <w:t>Good:</w:t>
+      </w:r>
+      <w:r>
+        <w:rPr>
+          <w:rStyle w:val="NormalTok"/>
+          <w:rFonts w:asciiTheme="majorHAnsi" w:hAnsiTheme="majorHAnsi" w:cstheme="majorBidi"/>
+          <w:b/>
+          <w:bCs/>
+        </w:rPr>
+        <w:tab/>
+      </w:r>
+      <w:r>
+        <w:rPr>
+          <w:rStyle w:val="NormalTok"/>
+          <w:rFonts w:asciiTheme="majorHAnsi" w:hAnsiTheme="majorHAnsi" w:cstheme="majorBidi"/>
+        </w:rPr>
+        <w:t>assignment_1.R</w:t>
+      </w:r>
+    </w:p>
+    <w:p>
+      <w:pPr>
+        <w:pStyle w:val="SourceCode"/>
+        <w:rPr>
+          <w:rStyle w:val="NormalTok"/>
+          <w:rFonts w:asciiTheme="majorHAnsi" w:hAnsiTheme="majorHAnsi" w:cstheme="majorBidi"/>
+          <w:b/>
+          <w:bCs/>
+        </w:rPr>
+      </w:pPr>
+      <w:r>
+        <w:rPr>
+          <w:rStyle w:val="NormalTok"/>
+          <w:rFonts w:asciiTheme="majorHAnsi" w:hAnsiTheme="majorHAnsi" w:cstheme="majorBidi"/>
+          <w:b/>
+          <w:bCs/>
+        </w:rPr>
+        <w:t>Avoid:</w:t>
+      </w:r>
+      <w:r>
+        <w:rPr>
+          <w:rStyle w:val="NormalTok"/>
+          <w:rFonts w:asciiTheme="majorHAnsi" w:hAnsiTheme="majorHAnsi" w:cstheme="majorBidi"/>
+          <w:b/>
+          <w:bCs/>
+        </w:rPr>
+        <w:tab/>
+      </w:r>
+      <w:r>
+        <w:rPr>
+          <w:rStyle w:val="NormalTok"/>
+          <w:rFonts w:asciiTheme="majorHAnsi" w:hAnsiTheme="majorHAnsi" w:cstheme="majorBidi"/>
+        </w:rPr>
+        <w:t>EDUC 641 Lab 2.R</w:t>
+      </w:r>
+    </w:p>
+    <w:p>
+      <w:pPr>
+        <w:jc w:val="center"/>
+        <w:rPr>
+          <w:b/>
+          <w:bCs/>
+        </w:rPr>
+      </w:pPr>
+      <w:r>
+        <w:rPr>
+          <w:b/>
+          <w:bCs/>
+        </w:rPr>
+        <w:t>Notice all file names are also lowercase, one word</w:t>
+      </w:r>
+      <w:r>
+        <w:rPr>
+          <w:b/>
+          <w:bCs/>
+        </w:rPr>
+        <w:t>.</w:t>
+      </w:r>
+    </w:p>
+    <w:p>
+      <w:pPr>
+        <w:pStyle w:val="ListParagraph"/>
+        <w:ind w:left="90"/>
+      </w:pPr>
+      <w:r>
+        <w:rPr>
           <w:noProof/>
           <w14:ligatures w14:val="standardContextual"/>
         </w:rPr>
+        <mc:AlternateContent>
+          <mc:Choice Requires="wpi">
+            <w:drawing>
+              <wp:anchor distT="0" distB="0" distL="114300" distR="114300" simplePos="0" relativeHeight="251669504" behindDoc="0" locked="0" layoutInCell="1" allowOverlap="1" wp14:anchorId="56AEE5A7" wp14:editId="0F86EE7B">
+                <wp:simplePos x="0" y="0"/>
+                <wp:positionH relativeFrom="column">
+                  <wp:posOffset>1387631</wp:posOffset>
+                </wp:positionH>
+                <wp:positionV relativeFrom="paragraph">
+                  <wp:posOffset>158210</wp:posOffset>
+                </wp:positionV>
+                <wp:extent cx="831960" cy="325440"/>
+                <wp:effectExtent l="38100" t="38100" r="31750" b="43180"/>
+                <wp:wrapNone/>
+                <wp:docPr id="1002610680" name="Ink 22"/>
+                <wp:cNvGraphicFramePr/>
+                <a:graphic xmlns:a="http://schemas.openxmlformats.org/drawingml/2006/main">
+                  <a:graphicData uri="http://schemas.microsoft.com/office/word/2010/wordprocessingInk">
+                    <w14:contentPart bwMode="auto" r:id="rId11">
+                      <w14:nvContentPartPr>
+                        <w14:cNvContentPartPr/>
+                      </w14:nvContentPartPr>
+                      <w14:xfrm>
+                        <a:off x="0" y="0"/>
+                        <a:ext cx="831960" cy="325440"/>
+                      </w14:xfrm>
+                    </w14:contentPart>
+                  </a:graphicData>
+                </a:graphic>
+              </wp:anchor>
+            </w:drawing>
+          </mc:Choice>
+          <mc:Fallback>
+            <w:pict>
+              <v:shapetype w14:anchorId="2176FF79" id="_x0000_t75" coordsize="21600,21600" o:spt="75" o:preferrelative="t" path="m@4@5l@4@11@9@11@9@5xe" filled="f" stroked="f">
+                <v:stroke joinstyle="miter"/>
+                <v:formulas>
+                  <v:f eqn="if lineDrawn pixelLineWidth 0"/>
+                  <v:f eqn="sum @0 1 0"/>
+                  <v:f eqn="sum 0 0 @1"/>
+                  <v:f eqn="prod @2 1 2"/>
+                  <v:f eqn="prod @3 21600 pixelWidth"/>
+                  <v:f eqn="prod @3 21600 pixelHeight"/>
+                  <v:f eqn="sum @0 0 1"/>
+                  <v:f eqn="prod @6 1 2"/>
+                  <v:f eqn="prod @7 21600 pixelWidth"/>
+                  <v:f eqn="sum @8 21600 0"/>
+                  <v:f eqn="prod @7 21600 pixelHeight"/>
+                  <v:f eqn="sum @10 21600 0"/>
+                </v:formulas>
+                <v:path o:extrusionok="f" gradientshapeok="t" o:connecttype="rect"/>
+                <o:lock v:ext="edit" aspectratio="t"/>
+              </v:shapetype>
+              <v:shape id="Ink 22" o:spid="_x0000_s1026" type="#_x0000_t75" style="position:absolute;margin-left:108.9pt;margin-top:12.1pt;width:66.2pt;height:26.35pt;z-index:251669504;visibility:visible;mso-wrap-style:square;mso-wrap-distance-left:9pt;mso-wrap-distance-top:0;mso-wrap-distance-right:9pt;mso-wrap-distance-bottom:0;mso-position-horizontal:absolute;mso-position-horizontal-relative:text;mso-position-vertical:absolute;mso-position-vertical-relative:text" o:gfxdata="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">
+                <v:imagedata r:id="rId12" o:title=""/>
+              </v:shape>
+            </w:pict>
+          </mc:Fallback>
+        </mc:AlternateContent>
+      </w:r>
+      <w:r>
+        <w:rPr>
+          <w:noProof/>
+          <w14:ligatures w14:val="standardContextual"/>
+        </w:rPr>
+        <mc:AlternateContent>
+          <mc:Choice Requires="wpi">
+            <w:drawing>
+              <wp:anchor distT="0" distB="0" distL="114300" distR="114300" simplePos="0" relativeHeight="251665408" behindDoc="0" locked="0" layoutInCell="1" allowOverlap="1" wp14:anchorId="117620C3" wp14:editId="5F4D4F0F">
+                <wp:simplePos x="0" y="0"/>
+                <wp:positionH relativeFrom="column">
+                  <wp:posOffset>4352925</wp:posOffset>
+                </wp:positionH>
+                <wp:positionV relativeFrom="paragraph">
+                  <wp:posOffset>789940</wp:posOffset>
+                </wp:positionV>
+                <wp:extent cx="582930" cy="605155"/>
+                <wp:effectExtent l="114300" t="114300" r="115570" b="118745"/>
+                <wp:wrapNone/>
+                <wp:docPr id="1514065569" name="Ink 10"/>
+                <wp:cNvGraphicFramePr/>
+                <a:graphic xmlns:a="http://schemas.openxmlformats.org/drawingml/2006/main">
+                  <a:graphicData uri="http://schemas.microsoft.com/office/word/2010/wordprocessingInk">
+                    <w14:contentPart bwMode="auto" r:id="rId13">
+                      <w14:nvContentPartPr>
+                        <w14:cNvContentPartPr/>
+                      </w14:nvContentPartPr>
+                      <w14:xfrm>
+                        <a:off x="0" y="0"/>
+                        <a:ext cx="582930" cy="605155"/>
+                      </w14:xfrm>
+                    </w14:contentPart>
+                  </a:graphicData>
+                </a:graphic>
+              </wp:anchor>
+            </w:drawing>
+          </mc:Choice>
+          <mc:Fallback>
+            <w:pict>
+              <v:shape w14:anchorId="05CE441B" id="Ink 10" o:spid="_x0000_s1026" type="#_x0000_t75" style="position:absolute;margin-left:337.8pt;margin-top:57.25pt;width:55.8pt;height:57.55pt;z-index:251665408;visibility:visible;mso-wrap-style:square;mso-wrap-distance-left:9pt;mso-wrap-distance-top:0;mso-wrap-distance-right:9pt;mso-wrap-distance-bottom:0;mso-position-horizontal:absolute;mso-position-horizontal-relative:text;mso-position-vertical:absolute;mso-position-vertical-relative:text" o:gfxdata="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">
+                <v:imagedata r:id="rId14" o:title=""/>
+              </v:shape>
+            </w:pict>
+          </mc:Fallback>
+        </mc:AlternateContent>
+      </w:r>
+      <w:r>
+        <w:rPr>
+          <w:noProof/>
+          <w14:ligatures w14:val="standardContextual"/>
+        </w:rPr>
         <w:drawing>
-          <wp:inline distT="0" distB="0" distL="0" distR="0" wp14:anchorId="27E133BA" wp14:editId="74ED8B4A">
-            <wp:extent cx="3048115" cy="1737360"/>
-            <wp:effectExtent l="0" t="0" r="0" b="2540"/>
-            <wp:docPr id="164248045" name="Picture 1" descr="A screenshot of a computer&#10;&#10;Description automatically generated"/>
+          <wp:inline distT="0" distB="0" distL="0" distR="0" wp14:anchorId="41372721" wp14:editId="7314AF6E">
+            <wp:extent cx="6010070" cy="2212975"/>
+            <wp:effectExtent l="0" t="0" r="0" b="0"/>
+            <wp:docPr id="1437885129" name="Picture 2"/>
             <wp:cNvGraphicFramePr>
               <a:graphicFrameLocks xmlns:a="http://schemas.openxmlformats.org/drawingml/2006/main" noChangeAspect="1"/>
             </wp:cNvGraphicFramePr>
@@ -695,433 +1567,7 @@
               <a:graphicData uri="http://schemas.openxmlformats.org/drawingml/2006/picture">
                 <pic:pic xmlns:pic="http://schemas.openxmlformats.org/drawingml/2006/picture">
                   <pic:nvPicPr>
-                    <pic:cNvPr id="164248045" name="Picture 1" descr="A screenshot of a computer&#10;&#10;Description automatically generated"/>
-                    <pic:cNvPicPr/>
-                  </pic:nvPicPr>
-                  <pic:blipFill>
-                    <a:blip r:embed="rId11" cstate="print">
-                      <a:extLst>
-                        <a:ext uri="{28A0092B-C50C-407E-A947-70E740481C1C}">
-                          <a14:useLocalDpi xmlns:a14="http://schemas.microsoft.com/office/drawing/2010/main" val="0"/>
-                        </a:ext>
-                      </a:extLst>
-                    </a:blip>
-                    <a:stretch>
-                      <a:fillRect/>
-                    </a:stretch>
-                  </pic:blipFill>
-                  <pic:spPr>
-                    <a:xfrm>
-                      <a:off x="0" y="0"/>
-                      <a:ext cx="3048115" cy="1737360"/>
-                    </a:xfrm>
-                    <a:prstGeom prst="rect">
-                      <a:avLst/>
-                    </a:prstGeom>
-                  </pic:spPr>
-                </pic:pic>
-              </a:graphicData>
-            </a:graphic>
-          </wp:inline>
-        </w:drawing>
-      </w:r>
-    </w:p>
-    <w:p>
-      <w:pPr>
-        <w:pStyle w:val="ListParagraph"/>
-        <w:ind w:left="1440"/>
-      </w:pPr>
-    </w:p>
-    <w:p>
-      <w:pPr>
-        <w:pStyle w:val="ListParagraph"/>
-        <w:numPr>
-          <w:ilvl w:val="1"/>
-          <w:numId w:val="4"/>
-        </w:numPr>
-      </w:pPr>
-      <w:r>
-        <w:lastRenderedPageBreak/>
-        <w:t xml:space="preserve">Add four more folders in the educ641_labs folder, label them </w:t>
-      </w:r>
-      <w:r>
-        <w:rPr>
-          <w:i/>
-          <w:iCs/>
-        </w:rPr>
-        <w:t>code, data, tables, figures</w:t>
-      </w:r>
-      <w:r>
-        <w:rPr>
-          <w:i/>
-          <w:iCs/>
-        </w:rPr>
-        <w:t xml:space="preserve"> </w:t>
-      </w:r>
-      <w:r>
-        <w:t xml:space="preserve">Note: try to keep everything lowercase and in one “string.” R doesn’t like spaces or capital letters. </w:t>
-      </w:r>
-    </w:p>
-    <w:p>
-      <w:pPr>
-        <w:pStyle w:val="ListParagraph"/>
-        <w:ind w:left="1440"/>
-      </w:pPr>
-      <w:r>
-        <w:rPr>
-          <w:noProof/>
-          <w14:ligatures w14:val="standardContextual"/>
-        </w:rPr>
-        <w:drawing>
-          <wp:inline distT="0" distB="0" distL="0" distR="0" wp14:anchorId="10E8BCA4" wp14:editId="668CC878">
-            <wp:extent cx="4460729" cy="2103120"/>
-            <wp:effectExtent l="0" t="0" r="0" b="5080"/>
-            <wp:docPr id="1526011495" name="Picture 4" descr="A screenshot of a computer&#10;&#10;Description automatically generated"/>
-            <wp:cNvGraphicFramePr>
-              <a:graphicFrameLocks xmlns:a="http://schemas.openxmlformats.org/drawingml/2006/main" noChangeAspect="1"/>
-            </wp:cNvGraphicFramePr>
-            <a:graphic xmlns:a="http://schemas.openxmlformats.org/drawingml/2006/main">
-              <a:graphicData uri="http://schemas.openxmlformats.org/drawingml/2006/picture">
-                <pic:pic xmlns:pic="http://schemas.openxmlformats.org/drawingml/2006/picture">
-                  <pic:nvPicPr>
-                    <pic:cNvPr id="1526011495" name="Picture 4" descr="A screenshot of a computer&#10;&#10;Description automatically generated"/>
-                    <pic:cNvPicPr/>
-                  </pic:nvPicPr>
-                  <pic:blipFill>
-                    <a:blip r:embed="rId12" cstate="print">
-                      <a:extLst>
-                        <a:ext uri="{28A0092B-C50C-407E-A947-70E740481C1C}">
-                          <a14:useLocalDpi xmlns:a14="http://schemas.microsoft.com/office/drawing/2010/main" val="0"/>
-                        </a:ext>
-                      </a:extLst>
-                    </a:blip>
-                    <a:stretch>
-                      <a:fillRect/>
-                    </a:stretch>
-                  </pic:blipFill>
-                  <pic:spPr>
-                    <a:xfrm>
-                      <a:off x="0" y="0"/>
-                      <a:ext cx="4460729" cy="2103120"/>
-                    </a:xfrm>
-                    <a:prstGeom prst="rect">
-                      <a:avLst/>
-                    </a:prstGeom>
-                  </pic:spPr>
-                </pic:pic>
-              </a:graphicData>
-            </a:graphic>
-          </wp:inline>
-        </w:drawing>
-      </w:r>
-    </w:p>
-    <w:p>
-      <w:pPr>
-        <w:pStyle w:val="ListParagraph"/>
-        <w:numPr>
-          <w:ilvl w:val="1"/>
-          <w:numId w:val="4"/>
-        </w:numPr>
-      </w:pPr>
-      <w:r>
-        <w:t xml:space="preserve">Then, </w:t>
-      </w:r>
-      <w:r>
-        <w:t xml:space="preserve">go to RStudio, </w:t>
-      </w:r>
-      <w:r>
-        <w:t xml:space="preserve">click on Files -&gt; New Project -&gt; </w:t>
-      </w:r>
-      <w:r>
-        <w:t>Existing</w:t>
-      </w:r>
-      <w:r>
-        <w:t xml:space="preserve"> Directory -&gt; </w:t>
-      </w:r>
-      <w:r>
-        <w:t>(select the educ641_labs file you created on your desktop in the educ641 folder) educ641_labs</w:t>
-      </w:r>
-    </w:p>
-    <w:p>
-      <w:pPr>
-        <w:pStyle w:val="ListParagraph"/>
-        <w:ind w:left="1440"/>
-      </w:pPr>
-      <w:r>
-        <w:rPr>
-          <w:noProof/>
-          <w14:ligatures w14:val="standardContextual"/>
-        </w:rPr>
-        <w:drawing>
-          <wp:inline distT="0" distB="0" distL="0" distR="0" wp14:anchorId="6A364F34" wp14:editId="5FDAC38C">
-            <wp:extent cx="4081054" cy="2286000"/>
-            <wp:effectExtent l="0" t="0" r="0" b="0"/>
-            <wp:docPr id="2135625952" name="Picture 3" descr="A screenshot of a project&#10;&#10;Description automatically generated"/>
-            <wp:cNvGraphicFramePr>
-              <a:graphicFrameLocks xmlns:a="http://schemas.openxmlformats.org/drawingml/2006/main" noChangeAspect="1"/>
-            </wp:cNvGraphicFramePr>
-            <a:graphic xmlns:a="http://schemas.openxmlformats.org/drawingml/2006/main">
-              <a:graphicData uri="http://schemas.openxmlformats.org/drawingml/2006/picture">
-                <pic:pic xmlns:pic="http://schemas.openxmlformats.org/drawingml/2006/picture">
-                  <pic:nvPicPr>
-                    <pic:cNvPr id="2135625952" name="Picture 3" descr="A screenshot of a project&#10;&#10;Description automatically generated"/>
-                    <pic:cNvPicPr/>
-                  </pic:nvPicPr>
-                  <pic:blipFill>
-                    <a:blip r:embed="rId13" cstate="print">
-                      <a:extLst>
-                        <a:ext uri="{28A0092B-C50C-407E-A947-70E740481C1C}">
-                          <a14:useLocalDpi xmlns:a14="http://schemas.microsoft.com/office/drawing/2010/main" val="0"/>
-                        </a:ext>
-                      </a:extLst>
-                    </a:blip>
-                    <a:stretch>
-                      <a:fillRect/>
-                    </a:stretch>
-                  </pic:blipFill>
-                  <pic:spPr>
-                    <a:xfrm>
-                      <a:off x="0" y="0"/>
-                      <a:ext cx="4081054" cy="2286000"/>
-                    </a:xfrm>
-                    <a:prstGeom prst="rect">
-                      <a:avLst/>
-                    </a:prstGeom>
-                  </pic:spPr>
-                </pic:pic>
-              </a:graphicData>
-            </a:graphic>
-          </wp:inline>
-        </w:drawing>
-      </w:r>
-    </w:p>
-    <w:p>
-      <w:pPr>
-        <w:pStyle w:val="ListParagraph"/>
-        <w:numPr>
-          <w:ilvl w:val="1"/>
-          <w:numId w:val="4"/>
-        </w:numPr>
-      </w:pPr>
-      <w:r>
-        <w:t xml:space="preserve">Now go to the location on your device and check if </w:t>
-      </w:r>
-      <w:r>
-        <w:t xml:space="preserve">your </w:t>
-      </w:r>
-      <w:proofErr w:type="spellStart"/>
-      <w:r>
-        <w:t>Rproj</w:t>
-      </w:r>
-      <w:proofErr w:type="spellEnd"/>
-      <w:r>
-        <w:t xml:space="preserve"> is in your educ641_labs folder with the four other folder you just created. It will look like a cube. Click on the </w:t>
-      </w:r>
-      <w:proofErr w:type="spellStart"/>
-      <w:r>
-        <w:t>Rproj</w:t>
-      </w:r>
-      <w:proofErr w:type="spellEnd"/>
-      <w:r>
-        <w:t xml:space="preserve"> cube and check in your bottom right panel under files tab to </w:t>
-      </w:r>
-      <w:r>
-        <w:lastRenderedPageBreak/>
-        <w:t xml:space="preserve">see if all your files are there. </w:t>
-      </w:r>
-      <w:r>
-        <w:rPr>
-          <w:noProof/>
-          <w14:ligatures w14:val="standardContextual"/>
-        </w:rPr>
-        <w:drawing>
-          <wp:inline distT="0" distB="0" distL="0" distR="0" wp14:anchorId="57A78E99" wp14:editId="5C4C4485">
-            <wp:extent cx="3549892" cy="3657600"/>
-            <wp:effectExtent l="0" t="0" r="6350" b="0"/>
-            <wp:docPr id="212035114" name="Picture 7" descr="A screenshot of a computer&#10;&#10;Description automatically generated"/>
-            <wp:cNvGraphicFramePr>
-              <a:graphicFrameLocks xmlns:a="http://schemas.openxmlformats.org/drawingml/2006/main" noChangeAspect="1"/>
-            </wp:cNvGraphicFramePr>
-            <a:graphic xmlns:a="http://schemas.openxmlformats.org/drawingml/2006/main">
-              <a:graphicData uri="http://schemas.openxmlformats.org/drawingml/2006/picture">
-                <pic:pic xmlns:pic="http://schemas.openxmlformats.org/drawingml/2006/picture">
-                  <pic:nvPicPr>
-                    <pic:cNvPr id="212035114" name="Picture 7" descr="A screenshot of a computer&#10;&#10;Description automatically generated"/>
-                    <pic:cNvPicPr/>
-                  </pic:nvPicPr>
-                  <pic:blipFill>
-                    <a:blip r:embed="rId14" cstate="print">
-                      <a:extLst>
-                        <a:ext uri="{28A0092B-C50C-407E-A947-70E740481C1C}">
-                          <a14:useLocalDpi xmlns:a14="http://schemas.microsoft.com/office/drawing/2010/main" val="0"/>
-                        </a:ext>
-                      </a:extLst>
-                    </a:blip>
-                    <a:stretch>
-                      <a:fillRect/>
-                    </a:stretch>
-                  </pic:blipFill>
-                  <pic:spPr>
-                    <a:xfrm>
-                      <a:off x="0" y="0"/>
-                      <a:ext cx="3549892" cy="3657600"/>
-                    </a:xfrm>
-                    <a:prstGeom prst="rect">
-                      <a:avLst/>
-                    </a:prstGeom>
-                  </pic:spPr>
-                </pic:pic>
-              </a:graphicData>
-            </a:graphic>
-          </wp:inline>
-        </w:drawing>
-      </w:r>
-    </w:p>
-    <w:p>
-      <w:pPr>
-        <w:pStyle w:val="ListParagraph"/>
-        <w:numPr>
-          <w:ilvl w:val="1"/>
-          <w:numId w:val="4"/>
-        </w:numPr>
-      </w:pPr>
-      <w:r>
-        <w:t xml:space="preserve">Try yourself: Make </w:t>
-      </w:r>
-      <w:r>
-        <w:t>another</w:t>
-      </w:r>
-      <w:r>
-        <w:t xml:space="preserve"> R project</w:t>
-      </w:r>
-      <w:r>
-        <w:t xml:space="preserve"> </w:t>
-      </w:r>
-      <w:r>
-        <w:t>for class assignments</w:t>
-      </w:r>
-      <w:r>
-        <w:t xml:space="preserve"> in your educ641_hw folder</w:t>
-      </w:r>
-    </w:p>
-    <w:p>
-      <w:r>
-        <w:t xml:space="preserve">Note: If you realize that you created an R project in the wrong directory, it is easier to delete it and then go through the process again for the correct directory. </w:t>
-      </w:r>
-    </w:p>
-    <w:p>
-      <w:pPr>
-        <w:pStyle w:val="ListParagraph"/>
-        <w:numPr>
-          <w:ilvl w:val="0"/>
-          <w:numId w:val="4"/>
-        </w:numPr>
-        <w:rPr>
-          <w:b/>
-          <w:bCs/>
-        </w:rPr>
-      </w:pPr>
-      <w:r>
-        <w:rPr>
-          <w:b/>
-          <w:bCs/>
-        </w:rPr>
-        <w:t xml:space="preserve">Save R script: </w:t>
-      </w:r>
-      <w:r>
-        <w:t xml:space="preserve">These “scripts” are </w:t>
-      </w:r>
-      <w:r>
-        <w:t xml:space="preserve">used for </w:t>
-      </w:r>
-      <w:r>
-        <w:t>writing</w:t>
-      </w:r>
-      <w:r>
-        <w:t xml:space="preserve"> and executing tasks in the </w:t>
-      </w:r>
-      <w:r>
-        <w:rPr>
-          <w:b/>
-          <w:bCs/>
-        </w:rPr>
-        <w:t>R programming language</w:t>
-      </w:r>
-      <w:r>
-        <w:t xml:space="preserve">, primarily designed for statistical computing and data analysis. </w:t>
-      </w:r>
-      <w:r>
-        <w:t xml:space="preserve">While we haven’t utilized this function yet, we would like you to save the script you opened in task 2 to your code folder for Lab 2. File -&gt; Save As… </w:t>
-      </w:r>
-      <w:r>
-        <w:t xml:space="preserve">[give name to file] </w:t>
-      </w:r>
-      <w:r>
-        <w:rPr>
-          <w:b/>
-          <w:bCs/>
-        </w:rPr>
-        <w:t>educ641_lab2</w:t>
-      </w:r>
-      <w:r>
-        <w:t xml:space="preserve"> (</w:t>
-      </w:r>
-      <w:r>
-        <w:rPr>
-          <w:b/>
-          <w:bCs/>
-          <w:u w:val="single"/>
-        </w:rPr>
-        <w:t xml:space="preserve">save </w:t>
-      </w:r>
-      <w:r>
-        <w:rPr>
-          <w:b/>
-          <w:bCs/>
-          <w:u w:val="single"/>
-        </w:rPr>
-        <w:t>in code folder</w:t>
-      </w:r>
-      <w:r>
-        <w:t xml:space="preserve">). </w:t>
-      </w:r>
-      <w:r>
-        <w:t xml:space="preserve">Please go to the file on your desktop and ensure </w:t>
-      </w:r>
-      <w:proofErr w:type="gramStart"/>
-      <w:r>
-        <w:t>your .R</w:t>
-      </w:r>
-      <w:proofErr w:type="gramEnd"/>
-      <w:r>
-        <w:t xml:space="preserve"> script is there. </w:t>
-      </w:r>
-      <w:r>
-        <w:sym w:font="Wingdings" w:char="F04A"/>
-      </w:r>
-      <w:r>
-        <w:t xml:space="preserve"> </w:t>
-      </w:r>
-    </w:p>
-    <w:p>
-      <w:r>
-        <w:rPr>
-          <w:noProof/>
-          <w14:ligatures w14:val="standardContextual"/>
-        </w:rPr>
-        <w:drawing>
-          <wp:inline distT="0" distB="0" distL="0" distR="0" wp14:anchorId="20C03450" wp14:editId="15AB00D9">
-            <wp:extent cx="3905892" cy="2194560"/>
-            <wp:effectExtent l="0" t="0" r="5715" b="2540"/>
-            <wp:docPr id="1788012931" name="Picture 9" descr="A screenshot of a computer&#10;&#10;Description automatically generated"/>
-            <wp:cNvGraphicFramePr>
-              <a:graphicFrameLocks xmlns:a="http://schemas.openxmlformats.org/drawingml/2006/main" noChangeAspect="1"/>
-            </wp:cNvGraphicFramePr>
-            <a:graphic xmlns:a="http://schemas.openxmlformats.org/drawingml/2006/main">
-              <a:graphicData uri="http://schemas.openxmlformats.org/drawingml/2006/picture">
-                <pic:pic xmlns:pic="http://schemas.openxmlformats.org/drawingml/2006/picture">
-                  <pic:nvPicPr>
-                    <pic:cNvPr id="1788012931" name="Picture 9" descr="A screenshot of a computer&#10;&#10;Description automatically generated"/>
+                    <pic:cNvPr id="1437885129" name="Picture 1437885129"/>
                     <pic:cNvPicPr/>
                   </pic:nvPicPr>
                   <pic:blipFill>
@@ -1139,7 +1585,7 @@
                   <pic:spPr>
                     <a:xfrm>
                       <a:off x="0" y="0"/>
-                      <a:ext cx="3905892" cy="2194560"/>
+                      <a:ext cx="6010070" cy="2212975"/>
                     </a:xfrm>
                     <a:prstGeom prst="rect">
                       <a:avLst/>
@@ -1152,9 +1598,915 @@
         </w:drawing>
       </w:r>
     </w:p>
+    <w:p>
+      <w:pPr>
+        <w:pStyle w:val="ListParagraph"/>
+        <w:numPr>
+          <w:ilvl w:val="1"/>
+          <w:numId w:val="4"/>
+        </w:numPr>
+      </w:pPr>
+      <w:r>
+        <w:t>Next</w:t>
+      </w:r>
+      <w:r>
+        <w:t xml:space="preserve">, </w:t>
+      </w:r>
+      <w:r>
+        <w:t xml:space="preserve">open </w:t>
+      </w:r>
+      <w:r>
+        <w:t>RStudio</w:t>
+      </w:r>
+      <w:r>
+        <w:t xml:space="preserve"> and</w:t>
+      </w:r>
+      <w:r>
+        <w:t xml:space="preserve"> </w:t>
+      </w:r>
+      <w:r>
+        <w:t xml:space="preserve">click on Files -&gt; New Project -&gt; </w:t>
+      </w:r>
+      <w:r>
+        <w:t>Existing</w:t>
+      </w:r>
+      <w:r>
+        <w:t xml:space="preserve"> Directory -&gt; </w:t>
+      </w:r>
+      <w:r>
+        <w:t xml:space="preserve">Browse -&gt; </w:t>
+      </w:r>
+      <w:r>
+        <w:t xml:space="preserve">select the </w:t>
+      </w:r>
+      <w:r>
+        <w:t>Desktop/</w:t>
+      </w:r>
+      <w:r>
+        <w:t>educ641</w:t>
+      </w:r>
+      <w:r>
+        <w:t>/educ641_R file path. This will make the educ641_R folder your ‘R project!’</w:t>
+      </w:r>
+    </w:p>
+    <w:p>
+      <w:pPr>
+        <w:pStyle w:val="ListParagraph"/>
+        <w:ind w:left="1440"/>
+      </w:pPr>
+      <w:r>
+        <w:rPr>
+          <w:noProof/>
+          <w14:ligatures w14:val="standardContextual"/>
+        </w:rPr>
+        <mc:AlternateContent>
+          <mc:Choice Requires="wpi">
+            <w:drawing>
+              <wp:anchor distT="0" distB="0" distL="114300" distR="114300" simplePos="0" relativeHeight="251670528" behindDoc="0" locked="0" layoutInCell="1" allowOverlap="1" wp14:anchorId="5AA01A63" wp14:editId="76D0E003">
+                <wp:simplePos x="0" y="0"/>
+                <wp:positionH relativeFrom="column">
+                  <wp:posOffset>2374751</wp:posOffset>
+                </wp:positionH>
+                <wp:positionV relativeFrom="paragraph">
+                  <wp:posOffset>1715404</wp:posOffset>
+                </wp:positionV>
+                <wp:extent cx="1149120" cy="324360"/>
+                <wp:effectExtent l="38100" t="38100" r="32385" b="31750"/>
+                <wp:wrapNone/>
+                <wp:docPr id="1977489686" name="Ink 23"/>
+                <wp:cNvGraphicFramePr/>
+                <a:graphic xmlns:a="http://schemas.openxmlformats.org/drawingml/2006/main">
+                  <a:graphicData uri="http://schemas.microsoft.com/office/word/2010/wordprocessingInk">
+                    <w14:contentPart bwMode="auto" r:id="rId16">
+                      <w14:nvContentPartPr>
+                        <w14:cNvContentPartPr/>
+                      </w14:nvContentPartPr>
+                      <w14:xfrm>
+                        <a:off x="0" y="0"/>
+                        <a:ext cx="1149120" cy="324360"/>
+                      </w14:xfrm>
+                    </w14:contentPart>
+                  </a:graphicData>
+                </a:graphic>
+              </wp:anchor>
+            </w:drawing>
+          </mc:Choice>
+          <mc:Fallback>
+            <w:pict>
+              <v:shape w14:anchorId="2E02FE66" id="Ink 23" o:spid="_x0000_s1026" type="#_x0000_t75" style="position:absolute;margin-left:186.65pt;margin-top:134.7pt;width:91.2pt;height:26.25pt;z-index:251670528;visibility:visible;mso-wrap-style:square;mso-wrap-distance-left:9pt;mso-wrap-distance-top:0;mso-wrap-distance-right:9pt;mso-wrap-distance-bottom:0;mso-position-horizontal:absolute;mso-position-horizontal-relative:text;mso-position-vertical:absolute;mso-position-vertical-relative:text" o:gfxdata="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">
+                <v:imagedata r:id="rId17" o:title=""/>
+              </v:shape>
+            </w:pict>
+          </mc:Fallback>
+        </mc:AlternateContent>
+      </w:r>
+      <w:r>
+        <w:rPr>
+          <w:noProof/>
+          <w14:ligatures w14:val="standardContextual"/>
+        </w:rPr>
+        <mc:AlternateContent>
+          <mc:Choice Requires="wpi">
+            <w:drawing>
+              <wp:anchor distT="0" distB="0" distL="114300" distR="114300" simplePos="0" relativeHeight="251666432" behindDoc="0" locked="0" layoutInCell="1" allowOverlap="1" wp14:anchorId="284FB66E" wp14:editId="07047A05">
+                <wp:simplePos x="0" y="0"/>
+                <wp:positionH relativeFrom="column">
+                  <wp:posOffset>3774431</wp:posOffset>
+                </wp:positionH>
+                <wp:positionV relativeFrom="paragraph">
+                  <wp:posOffset>1388060</wp:posOffset>
+                </wp:positionV>
+                <wp:extent cx="921960" cy="602640"/>
+                <wp:effectExtent l="38100" t="38100" r="31115" b="45085"/>
+                <wp:wrapNone/>
+                <wp:docPr id="1297376244" name="Ink 13"/>
+                <wp:cNvGraphicFramePr/>
+                <a:graphic xmlns:a="http://schemas.openxmlformats.org/drawingml/2006/main">
+                  <a:graphicData uri="http://schemas.microsoft.com/office/word/2010/wordprocessingInk">
+                    <w14:contentPart bwMode="auto" r:id="rId18">
+                      <w14:nvContentPartPr>
+                        <w14:cNvContentPartPr/>
+                      </w14:nvContentPartPr>
+                      <w14:xfrm>
+                        <a:off x="0" y="0"/>
+                        <a:ext cx="921960" cy="602640"/>
+                      </w14:xfrm>
+                    </w14:contentPart>
+                  </a:graphicData>
+                </a:graphic>
+              </wp:anchor>
+            </w:drawing>
+          </mc:Choice>
+          <mc:Fallback>
+            <w:pict>
+              <v:shape w14:anchorId="761B7FD2" id="Ink 13" o:spid="_x0000_s1026" type="#_x0000_t75" style="position:absolute;margin-left:296.5pt;margin-top:108.6pt;width:74.05pt;height:48.85pt;z-index:251666432;visibility:visible;mso-wrap-style:square;mso-wrap-distance-left:9pt;mso-wrap-distance-top:0;mso-wrap-distance-right:9pt;mso-wrap-distance-bottom:0;mso-position-horizontal:absolute;mso-position-horizontal-relative:text;mso-position-vertical:absolute;mso-position-vertical-relative:text" o:gfxdata="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">
+                <v:imagedata r:id="rId19" o:title=""/>
+              </v:shape>
+            </w:pict>
+          </mc:Fallback>
+        </mc:AlternateContent>
+      </w:r>
+      <w:r>
+        <w:rPr>
+          <w:noProof/>
+          <w14:ligatures w14:val="standardContextual"/>
+        </w:rPr>
+        <w:drawing>
+          <wp:inline distT="0" distB="0" distL="0" distR="0" wp14:anchorId="6A364F34" wp14:editId="3AFA70A1">
+            <wp:extent cx="4813057" cy="2696031"/>
+            <wp:effectExtent l="12700" t="12700" r="13335" b="9525"/>
+            <wp:docPr id="2135625952" name="Picture 3" descr="A screenshot of a project&#10;&#10;Description automatically generated"/>
+            <wp:cNvGraphicFramePr>
+              <a:graphicFrameLocks xmlns:a="http://schemas.openxmlformats.org/drawingml/2006/main" noChangeAspect="1"/>
+            </wp:cNvGraphicFramePr>
+            <a:graphic xmlns:a="http://schemas.openxmlformats.org/drawingml/2006/main">
+              <a:graphicData uri="http://schemas.openxmlformats.org/drawingml/2006/picture">
+                <pic:pic xmlns:pic="http://schemas.openxmlformats.org/drawingml/2006/picture">
+                  <pic:nvPicPr>
+                    <pic:cNvPr id="2135625952" name="Picture 3" descr="A screenshot of a project&#10;&#10;Description automatically generated"/>
+                    <pic:cNvPicPr/>
+                  </pic:nvPicPr>
+                  <pic:blipFill>
+                    <a:blip r:embed="rId20" cstate="print">
+                      <a:extLst>
+                        <a:ext uri="{28A0092B-C50C-407E-A947-70E740481C1C}">
+                          <a14:useLocalDpi xmlns:a14="http://schemas.microsoft.com/office/drawing/2010/main" val="0"/>
+                        </a:ext>
+                      </a:extLst>
+                    </a:blip>
+                    <a:stretch>
+                      <a:fillRect/>
+                    </a:stretch>
+                  </pic:blipFill>
+                  <pic:spPr>
+                    <a:xfrm>
+                      <a:off x="0" y="0"/>
+                      <a:ext cx="4944034" cy="2769397"/>
+                    </a:xfrm>
+                    <a:prstGeom prst="rect">
+                      <a:avLst/>
+                    </a:prstGeom>
+                    <a:ln>
+                      <a:solidFill>
+                        <a:srgbClr val="EE0000"/>
+                      </a:solidFill>
+                    </a:ln>
+                  </pic:spPr>
+                </pic:pic>
+              </a:graphicData>
+            </a:graphic>
+          </wp:inline>
+        </w:drawing>
+      </w:r>
+    </w:p>
+    <w:p>
+      <w:pPr>
+        <w:ind w:left="1080"/>
+      </w:pPr>
+      <w:r>
+        <w:rPr>
+          <w:noProof/>
+          <w14:ligatures w14:val="standardContextual"/>
+        </w:rPr>
+        <w:lastRenderedPageBreak/>
+        <mc:AlternateContent>
+          <mc:Choice Requires="wpi">
+            <w:drawing>
+              <wp:anchor distT="0" distB="0" distL="114300" distR="114300" simplePos="0" relativeHeight="251671552" behindDoc="0" locked="0" layoutInCell="1" allowOverlap="1" wp14:anchorId="08E8364A" wp14:editId="01F35C8E">
+                <wp:simplePos x="0" y="0"/>
+                <wp:positionH relativeFrom="column">
+                  <wp:posOffset>2653391</wp:posOffset>
+                </wp:positionH>
+                <wp:positionV relativeFrom="paragraph">
+                  <wp:posOffset>1126762</wp:posOffset>
+                </wp:positionV>
+                <wp:extent cx="596160" cy="245520"/>
+                <wp:effectExtent l="38100" t="38100" r="0" b="34290"/>
+                <wp:wrapNone/>
+                <wp:docPr id="138816579" name="Ink 24"/>
+                <wp:cNvGraphicFramePr/>
+                <a:graphic xmlns:a="http://schemas.openxmlformats.org/drawingml/2006/main">
+                  <a:graphicData uri="http://schemas.microsoft.com/office/word/2010/wordprocessingInk">
+                    <w14:contentPart bwMode="auto" r:id="rId21">
+                      <w14:nvContentPartPr>
+                        <w14:cNvContentPartPr/>
+                      </w14:nvContentPartPr>
+                      <w14:xfrm>
+                        <a:off x="0" y="0"/>
+                        <a:ext cx="596160" cy="245520"/>
+                      </w14:xfrm>
+                    </w14:contentPart>
+                  </a:graphicData>
+                </a:graphic>
+              </wp:anchor>
+            </w:drawing>
+          </mc:Choice>
+          <mc:Fallback>
+            <w:pict>
+              <v:shape w14:anchorId="0D8AFC24" id="Ink 24" o:spid="_x0000_s1026" type="#_x0000_t75" style="position:absolute;margin-left:208.6pt;margin-top:88.35pt;width:47.65pt;height:20.05pt;z-index:251671552;visibility:visible;mso-wrap-style:square;mso-wrap-distance-left:9pt;mso-wrap-distance-top:0;mso-wrap-distance-right:9pt;mso-wrap-distance-bottom:0;mso-position-horizontal:absolute;mso-position-horizontal-relative:text;mso-position-vertical:absolute;mso-position-vertical-relative:text" o:gfxdata="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">
+                <v:imagedata r:id="rId22" o:title=""/>
+              </v:shape>
+            </w:pict>
+          </mc:Fallback>
+        </mc:AlternateContent>
+      </w:r>
+      <w:r>
+        <w:rPr>
+          <w:noProof/>
+          <w14:ligatures w14:val="standardContextual"/>
+        </w:rPr>
+        <mc:AlternateContent>
+          <mc:Choice Requires="wpi">
+            <w:drawing>
+              <wp:anchor distT="0" distB="0" distL="114300" distR="114300" simplePos="0" relativeHeight="251668480" behindDoc="0" locked="0" layoutInCell="1" allowOverlap="1" wp14:anchorId="1268C42F" wp14:editId="627E84C7">
+                <wp:simplePos x="0" y="0"/>
+                <wp:positionH relativeFrom="column">
+                  <wp:posOffset>2841671</wp:posOffset>
+                </wp:positionH>
+                <wp:positionV relativeFrom="paragraph">
+                  <wp:posOffset>2587747</wp:posOffset>
+                </wp:positionV>
+                <wp:extent cx="793080" cy="526320"/>
+                <wp:effectExtent l="38100" t="38100" r="33020" b="33020"/>
+                <wp:wrapNone/>
+                <wp:docPr id="391476430" name="Ink 18"/>
+                <wp:cNvGraphicFramePr/>
+                <a:graphic xmlns:a="http://schemas.openxmlformats.org/drawingml/2006/main">
+                  <a:graphicData uri="http://schemas.microsoft.com/office/word/2010/wordprocessingInk">
+                    <w14:contentPart bwMode="auto" r:id="rId23">
+                      <w14:nvContentPartPr>
+                        <w14:cNvContentPartPr/>
+                      </w14:nvContentPartPr>
+                      <w14:xfrm>
+                        <a:off x="0" y="0"/>
+                        <a:ext cx="793080" cy="526320"/>
+                      </w14:xfrm>
+                    </w14:contentPart>
+                  </a:graphicData>
+                </a:graphic>
+              </wp:anchor>
+            </w:drawing>
+          </mc:Choice>
+          <mc:Fallback>
+            <w:pict>
+              <v:shape w14:anchorId="0686795B" id="Ink 18" o:spid="_x0000_s1026" type="#_x0000_t75" style="position:absolute;margin-left:223.4pt;margin-top:203.4pt;width:63.2pt;height:42.15pt;z-index:251668480;visibility:visible;mso-wrap-style:square;mso-wrap-distance-left:9pt;mso-wrap-distance-top:0;mso-wrap-distance-right:9pt;mso-wrap-distance-bottom:0;mso-position-horizontal:absolute;mso-position-horizontal-relative:text;mso-position-vertical:absolute;mso-position-vertical-relative:text" o:gfxdata="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">
+                <v:imagedata r:id="rId24" o:title=""/>
+              </v:shape>
+            </w:pict>
+          </mc:Fallback>
+        </mc:AlternateContent>
+      </w:r>
+      <w:r>
+        <w:rPr>
+          <w:noProof/>
+          <w14:ligatures w14:val="standardContextual"/>
+        </w:rPr>
+        <w:drawing>
+          <wp:inline distT="0" distB="0" distL="0" distR="0" wp14:anchorId="0F3E99D4" wp14:editId="6D6FBF8E">
+            <wp:extent cx="4834647" cy="3368757"/>
+            <wp:effectExtent l="0" t="0" r="4445" b="0"/>
+            <wp:docPr id="904165190" name="Picture 12"/>
+            <wp:cNvGraphicFramePr>
+              <a:graphicFrameLocks xmlns:a="http://schemas.openxmlformats.org/drawingml/2006/main" noChangeAspect="1"/>
+            </wp:cNvGraphicFramePr>
+            <a:graphic xmlns:a="http://schemas.openxmlformats.org/drawingml/2006/main">
+              <a:graphicData uri="http://schemas.openxmlformats.org/drawingml/2006/picture">
+                <pic:pic xmlns:pic="http://schemas.openxmlformats.org/drawingml/2006/picture">
+                  <pic:nvPicPr>
+                    <pic:cNvPr id="904165190" name="Picture 904165190"/>
+                    <pic:cNvPicPr/>
+                  </pic:nvPicPr>
+                  <pic:blipFill>
+                    <a:blip r:embed="rId25" cstate="print">
+                      <a:extLst>
+                        <a:ext uri="{28A0092B-C50C-407E-A947-70E740481C1C}">
+                          <a14:useLocalDpi xmlns:a14="http://schemas.microsoft.com/office/drawing/2010/main" val="0"/>
+                        </a:ext>
+                      </a:extLst>
+                    </a:blip>
+                    <a:stretch>
+                      <a:fillRect/>
+                    </a:stretch>
+                  </pic:blipFill>
+                  <pic:spPr>
+                    <a:xfrm>
+                      <a:off x="0" y="0"/>
+                      <a:ext cx="4901263" cy="3415175"/>
+                    </a:xfrm>
+                    <a:prstGeom prst="rect">
+                      <a:avLst/>
+                    </a:prstGeom>
+                  </pic:spPr>
+                </pic:pic>
+              </a:graphicData>
+            </a:graphic>
+          </wp:inline>
+        </w:drawing>
+      </w:r>
+      <w:r>
+        <w:t xml:space="preserve"> </w:t>
+      </w:r>
+    </w:p>
+    <w:p>
+      <w:pPr>
+        <w:pStyle w:val="ListParagraph"/>
+        <w:numPr>
+          <w:ilvl w:val="1"/>
+          <w:numId w:val="4"/>
+        </w:numPr>
+      </w:pPr>
+      <w:r>
+        <w:t xml:space="preserve">Close </w:t>
+      </w:r>
+      <w:r>
+        <w:t xml:space="preserve">RStudio and open your newly created R project on your desktop </w:t>
+      </w:r>
+      <w:r>
+        <w:t>location</w:t>
+      </w:r>
+      <w:r>
+        <w:t xml:space="preserve"> by</w:t>
+      </w:r>
+      <w:r>
+        <w:t xml:space="preserve"> check</w:t>
+      </w:r>
+      <w:r>
+        <w:t>ing</w:t>
+      </w:r>
+      <w:r>
+        <w:t xml:space="preserve"> if </w:t>
+      </w:r>
+      <w:proofErr w:type="spellStart"/>
+      <w:proofErr w:type="gramStart"/>
+      <w:r>
+        <w:t>your</w:t>
+      </w:r>
+      <w:r>
+        <w:t>.</w:t>
+      </w:r>
+      <w:r>
+        <w:t>Rproj</w:t>
+      </w:r>
+      <w:proofErr w:type="spellEnd"/>
+      <w:proofErr w:type="gramEnd"/>
+      <w:r>
+        <w:t xml:space="preserve"> </w:t>
+      </w:r>
+      <w:r>
+        <w:t>(R ‘</w:t>
+      </w:r>
+      <w:r>
+        <w:rPr>
+          <w:b/>
+          <w:bCs/>
+          <w:color w:val="156082" w:themeColor="accent1"/>
+        </w:rPr>
+        <w:t>cube</w:t>
+      </w:r>
+      <w:r>
+        <w:t xml:space="preserve">’) </w:t>
+      </w:r>
+      <w:r>
+        <w:t>is in your educ641 folder</w:t>
+      </w:r>
+      <w:r>
+        <w:t xml:space="preserve">. Always open R projects by clicking the </w:t>
+      </w:r>
+      <w:r>
+        <w:rPr>
+          <w:b/>
+          <w:bCs/>
+          <w:i/>
+          <w:iCs/>
+          <w:color w:val="156082" w:themeColor="accent1"/>
+        </w:rPr>
+        <w:t>cube</w:t>
+      </w:r>
+      <w:r>
+        <w:rPr>
+          <w:i/>
+          <w:iCs/>
+        </w:rPr>
+        <w:t>,</w:t>
+      </w:r>
+      <w:r>
+        <w:t xml:space="preserve"> </w:t>
+      </w:r>
+      <w:r>
+        <w:rPr>
+          <w:b/>
+          <w:bCs/>
+        </w:rPr>
+        <w:t>not</w:t>
+      </w:r>
+      <w:r>
+        <w:t xml:space="preserve"> via your </w:t>
+      </w:r>
+      <w:r>
+        <w:rPr>
+          <w:b/>
+          <w:bCs/>
+          <w:i/>
+          <w:iCs/>
+        </w:rPr>
+        <w:t>code</w:t>
+      </w:r>
+      <w:r>
+        <w:t xml:space="preserve"> folder. When RStudio reopens, make sure the </w:t>
+      </w:r>
+      <w:r>
+        <w:t>four</w:t>
+      </w:r>
+      <w:r>
+        <w:t xml:space="preserve"> other folders are visible in your bottom right panel under the Files tab.</w:t>
+      </w:r>
+    </w:p>
+    <w:p>
+      <w:pPr>
+        <w:ind w:left="90"/>
+        <w:jc w:val="center"/>
+      </w:pPr>
+      <w:r>
+        <w:rPr>
+          <w:noProof/>
+          <w14:ligatures w14:val="standardContextual"/>
+        </w:rPr>
+        <mc:AlternateContent>
+          <mc:Choice Requires="wpi">
+            <w:drawing>
+              <wp:anchor distT="0" distB="0" distL="114300" distR="114300" simplePos="0" relativeHeight="251672576" behindDoc="0" locked="0" layoutInCell="1" allowOverlap="1" wp14:anchorId="66077476" wp14:editId="4F945C51">
+                <wp:simplePos x="0" y="0"/>
+                <wp:positionH relativeFrom="column">
+                  <wp:posOffset>3857591</wp:posOffset>
+                </wp:positionH>
+                <wp:positionV relativeFrom="paragraph">
+                  <wp:posOffset>1319528</wp:posOffset>
+                </wp:positionV>
+                <wp:extent cx="394560" cy="195120"/>
+                <wp:effectExtent l="38100" t="38100" r="12065" b="33655"/>
+                <wp:wrapNone/>
+                <wp:docPr id="1600218958" name="Ink 25"/>
+                <wp:cNvGraphicFramePr/>
+                <a:graphic xmlns:a="http://schemas.openxmlformats.org/drawingml/2006/main">
+                  <a:graphicData uri="http://schemas.microsoft.com/office/word/2010/wordprocessingInk">
+                    <w14:contentPart bwMode="auto" r:id="rId26">
+                      <w14:nvContentPartPr>
+                        <w14:cNvContentPartPr/>
+                      </w14:nvContentPartPr>
+                      <w14:xfrm>
+                        <a:off x="0" y="0"/>
+                        <a:ext cx="394560" cy="195120"/>
+                      </w14:xfrm>
+                    </w14:contentPart>
+                  </a:graphicData>
+                </a:graphic>
+              </wp:anchor>
+            </w:drawing>
+          </mc:Choice>
+          <mc:Fallback>
+            <w:pict>
+              <v:shape w14:anchorId="5AA2D75B" id="Ink 25" o:spid="_x0000_s1026" type="#_x0000_t75" style="position:absolute;margin-left:303.4pt;margin-top:103.55pt;width:31.75pt;height:16.05pt;z-index:251672576;visibility:visible;mso-wrap-style:square;mso-wrap-distance-left:9pt;mso-wrap-distance-top:0;mso-wrap-distance-right:9pt;mso-wrap-distance-bottom:0;mso-position-horizontal:absolute;mso-position-horizontal-relative:text;mso-position-vertical:absolute;mso-position-vertical-relative:text" o:gfxdata="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">
+                <v:imagedata r:id="rId27" o:title=""/>
+              </v:shape>
+            </w:pict>
+          </mc:Fallback>
+        </mc:AlternateContent>
+      </w:r>
+      <w:r>
+        <w:rPr>
+          <w:noProof/>
+          <w14:ligatures w14:val="standardContextual"/>
+        </w:rPr>
+        <w:drawing>
+          <wp:inline distT="0" distB="0" distL="0" distR="0" wp14:anchorId="6A95146D" wp14:editId="44B1A0B9">
+            <wp:extent cx="4688732" cy="3169402"/>
+            <wp:effectExtent l="0" t="0" r="0" b="5715"/>
+            <wp:docPr id="594053030" name="Picture 11"/>
+            <wp:cNvGraphicFramePr>
+              <a:graphicFrameLocks xmlns:a="http://schemas.openxmlformats.org/drawingml/2006/main" noChangeAspect="1"/>
+            </wp:cNvGraphicFramePr>
+            <a:graphic xmlns:a="http://schemas.openxmlformats.org/drawingml/2006/main">
+              <a:graphicData uri="http://schemas.openxmlformats.org/drawingml/2006/picture">
+                <pic:pic xmlns:pic="http://schemas.openxmlformats.org/drawingml/2006/picture">
+                  <pic:nvPicPr>
+                    <pic:cNvPr id="594053030" name="Picture 594053030"/>
+                    <pic:cNvPicPr/>
+                  </pic:nvPicPr>
+                  <pic:blipFill>
+                    <a:blip r:embed="rId28" cstate="print">
+                      <a:extLst>
+                        <a:ext uri="{28A0092B-C50C-407E-A947-70E740481C1C}">
+                          <a14:useLocalDpi xmlns:a14="http://schemas.microsoft.com/office/drawing/2010/main" val="0"/>
+                        </a:ext>
+                      </a:extLst>
+                    </a:blip>
+                    <a:stretch>
+                      <a:fillRect/>
+                    </a:stretch>
+                  </pic:blipFill>
+                  <pic:spPr>
+                    <a:xfrm>
+                      <a:off x="0" y="0"/>
+                      <a:ext cx="4711016" cy="3184465"/>
+                    </a:xfrm>
+                    <a:prstGeom prst="rect">
+                      <a:avLst/>
+                    </a:prstGeom>
+                  </pic:spPr>
+                </pic:pic>
+              </a:graphicData>
+            </a:graphic>
+          </wp:inline>
+        </w:drawing>
+      </w:r>
+    </w:p>
+    <w:p>
+      <w:pPr>
+        <w:jc w:val="center"/>
+        <w:rPr>
+          <w:b/>
+          <w:bCs/>
+        </w:rPr>
+      </w:pPr>
+    </w:p>
+    <w:p>
+      <w:r>
+        <w:rPr>
+          <w:b/>
+          <w:bCs/>
+        </w:rPr>
+        <w:t>Note:</w:t>
+      </w:r>
+      <w:r>
+        <w:t xml:space="preserve"> If you realize that you created an R project in the wrong directory, it is easier to delete it and then go through the process again for the correct directory. </w:t>
+      </w:r>
+    </w:p>
+    <w:p>
+      <w:pPr>
+        <w:pStyle w:val="ListParagraph"/>
+        <w:numPr>
+          <w:ilvl w:val="0"/>
+          <w:numId w:val="4"/>
+        </w:numPr>
+        <w:rPr>
+          <w:b/>
+          <w:bCs/>
+        </w:rPr>
+      </w:pPr>
+      <w:r>
+        <w:rPr>
+          <w:b/>
+          <w:bCs/>
+        </w:rPr>
+        <w:lastRenderedPageBreak/>
+        <w:t xml:space="preserve">Save R script: </w:t>
+      </w:r>
+      <w:r>
+        <w:t xml:space="preserve">These “scripts” are </w:t>
+      </w:r>
+      <w:r>
+        <w:t xml:space="preserve">used for </w:t>
+      </w:r>
+      <w:r>
+        <w:t>writing</w:t>
+      </w:r>
+      <w:r>
+        <w:t xml:space="preserve"> and executing tasks in the </w:t>
+      </w:r>
+      <w:r>
+        <w:t xml:space="preserve">R programming language, </w:t>
+      </w:r>
+      <w:r>
+        <w:t xml:space="preserve">primarily designed for statistical computing and data analysis. </w:t>
+      </w:r>
+      <w:r>
+        <w:t xml:space="preserve">While we haven’t utilized this function yet, we would like you </w:t>
+      </w:r>
+      <w:r>
+        <w:t>open and save a</w:t>
+      </w:r>
+      <w:r>
+        <w:t xml:space="preserve"> script </w:t>
+      </w:r>
+      <w:r>
+        <w:t xml:space="preserve">as shown in </w:t>
+      </w:r>
+      <w:r>
+        <w:t>task 2</w:t>
+      </w:r>
+      <w:r>
+        <w:t xml:space="preserve"> (file source)</w:t>
+      </w:r>
+      <w:r>
+        <w:t xml:space="preserve"> to your code folder for </w:t>
+      </w:r>
+      <w:r>
+        <w:t>l</w:t>
+      </w:r>
+      <w:r>
+        <w:t xml:space="preserve">ab 2. File -&gt; Save As… </w:t>
+      </w:r>
+      <w:r>
+        <w:t xml:space="preserve">[give name to file] </w:t>
+      </w:r>
+      <w:r>
+        <w:t xml:space="preserve">e.g., </w:t>
+      </w:r>
+      <w:r>
+        <w:rPr>
+          <w:b/>
+          <w:bCs/>
+        </w:rPr>
+        <w:t>educ641_lab2</w:t>
+      </w:r>
+      <w:r>
+        <w:t xml:space="preserve"> (</w:t>
+      </w:r>
+      <w:r>
+        <w:t xml:space="preserve">and </w:t>
+      </w:r>
+      <w:r>
+        <w:rPr>
+          <w:b/>
+          <w:bCs/>
+          <w:u w:val="single"/>
+        </w:rPr>
+        <w:t xml:space="preserve">save </w:t>
+      </w:r>
+      <w:r>
+        <w:rPr>
+          <w:b/>
+          <w:bCs/>
+          <w:u w:val="single"/>
+        </w:rPr>
+        <w:t>in code folder</w:t>
+      </w:r>
+      <w:r>
+        <w:t xml:space="preserve">). </w:t>
+      </w:r>
+      <w:r>
+        <w:t>Please go to the file on your desktop an</w:t>
+      </w:r>
+      <w:r>
+        <w:t xml:space="preserve">d </w:t>
+      </w:r>
+      <w:r>
+        <w:t xml:space="preserve">ensure your </w:t>
+      </w:r>
+      <w:proofErr w:type="gramStart"/>
+      <w:r>
+        <w:t>‘</w:t>
+      </w:r>
+      <w:r>
+        <w:t>.R</w:t>
+      </w:r>
+      <w:proofErr w:type="gramEnd"/>
+      <w:r>
+        <w:t>’</w:t>
+      </w:r>
+      <w:r>
+        <w:t xml:space="preserve"> script is there. </w:t>
+      </w:r>
+      <w:r>
+        <w:sym w:font="Wingdings" w:char="F04A"/>
+      </w:r>
+      <w:r>
+        <w:t xml:space="preserve"> </w:t>
+      </w:r>
+    </w:p>
+    <w:p>
+      <w:pPr>
+        <w:pStyle w:val="ListParagraph"/>
+        <w:rPr>
+          <w:b/>
+          <w:bCs/>
+        </w:rPr>
+      </w:pPr>
+      <w:r>
+        <w:rPr>
+          <w:noProof/>
+        </w:rPr>
+        <w:drawing>
+          <wp:inline distT="0" distB="0" distL="0" distR="0" wp14:anchorId="2CD6A454" wp14:editId="163D31F1">
+            <wp:extent cx="5136204" cy="3578881"/>
+            <wp:effectExtent l="0" t="0" r="0" b="2540"/>
+            <wp:docPr id="510852357" name="Picture 19"/>
+            <wp:cNvGraphicFramePr>
+              <a:graphicFrameLocks xmlns:a="http://schemas.openxmlformats.org/drawingml/2006/main" noChangeAspect="1"/>
+            </wp:cNvGraphicFramePr>
+            <a:graphic xmlns:a="http://schemas.openxmlformats.org/drawingml/2006/main">
+              <a:graphicData uri="http://schemas.openxmlformats.org/drawingml/2006/picture">
+                <pic:pic xmlns:pic="http://schemas.openxmlformats.org/drawingml/2006/picture">
+                  <pic:nvPicPr>
+                    <pic:cNvPr id="510852357" name="Picture 510852357"/>
+                    <pic:cNvPicPr/>
+                  </pic:nvPicPr>
+                  <pic:blipFill>
+                    <a:blip r:embed="rId29" cstate="print">
+                      <a:extLst>
+                        <a:ext uri="{28A0092B-C50C-407E-A947-70E740481C1C}">
+                          <a14:useLocalDpi xmlns:a14="http://schemas.microsoft.com/office/drawing/2010/main" val="0"/>
+                        </a:ext>
+                      </a:extLst>
+                    </a:blip>
+                    <a:stretch>
+                      <a:fillRect/>
+                    </a:stretch>
+                  </pic:blipFill>
+                  <pic:spPr>
+                    <a:xfrm>
+                      <a:off x="0" y="0"/>
+                      <a:ext cx="5172582" cy="3604229"/>
+                    </a:xfrm>
+                    <a:prstGeom prst="rect">
+                      <a:avLst/>
+                    </a:prstGeom>
+                  </pic:spPr>
+                </pic:pic>
+              </a:graphicData>
+            </a:graphic>
+          </wp:inline>
+        </w:drawing>
+      </w:r>
+    </w:p>
+    <w:p>
+      <w:pPr>
+        <w:ind w:left="360"/>
+      </w:pPr>
+    </w:p>
+    <w:p>
+      <w:pPr>
+        <w:ind w:left="360"/>
+      </w:pPr>
+      <w:r>
+        <w:t xml:space="preserve">Checklist </w:t>
+      </w:r>
+      <w:r>
+        <w:t xml:space="preserve">on desktop </w:t>
+      </w:r>
+      <w:r>
+        <w:rPr>
+          <w:b/>
+          <w:bCs/>
+        </w:rPr>
+        <w:t>here:</w:t>
+      </w:r>
+      <w:r>
+        <w:t xml:space="preserve"> </w:t>
+      </w:r>
+      <w:r>
+        <w:rPr>
+          <w:noProof/>
+          <w14:ligatures w14:val="standardContextual"/>
+        </w:rPr>
+        <w:drawing>
+          <wp:inline distT="0" distB="0" distL="0" distR="0" wp14:anchorId="4C4E75F7" wp14:editId="150C5C4A">
+            <wp:extent cx="5184843" cy="2874296"/>
+            <wp:effectExtent l="0" t="0" r="0" b="0"/>
+            <wp:docPr id="349143874" name="Picture 20"/>
+            <wp:cNvGraphicFramePr>
+              <a:graphicFrameLocks xmlns:a="http://schemas.openxmlformats.org/drawingml/2006/main" noChangeAspect="1"/>
+            </wp:cNvGraphicFramePr>
+            <a:graphic xmlns:a="http://schemas.openxmlformats.org/drawingml/2006/main">
+              <a:graphicData uri="http://schemas.openxmlformats.org/drawingml/2006/picture">
+                <pic:pic xmlns:pic="http://schemas.openxmlformats.org/drawingml/2006/picture">
+                  <pic:nvPicPr>
+                    <pic:cNvPr id="349143874" name="Picture 349143874"/>
+                    <pic:cNvPicPr/>
+                  </pic:nvPicPr>
+                  <pic:blipFill>
+                    <a:blip r:embed="rId30" cstate="print">
+                      <a:extLst>
+                        <a:ext uri="{28A0092B-C50C-407E-A947-70E740481C1C}">
+                          <a14:useLocalDpi xmlns:a14="http://schemas.microsoft.com/office/drawing/2010/main" val="0"/>
+                        </a:ext>
+                      </a:extLst>
+                    </a:blip>
+                    <a:stretch>
+                      <a:fillRect/>
+                    </a:stretch>
+                  </pic:blipFill>
+                  <pic:spPr>
+                    <a:xfrm>
+                      <a:off x="0" y="0"/>
+                      <a:ext cx="5214328" cy="2890642"/>
+                    </a:xfrm>
+                    <a:prstGeom prst="rect">
+                      <a:avLst/>
+                    </a:prstGeom>
+                  </pic:spPr>
+                </pic:pic>
+              </a:graphicData>
+            </a:graphic>
+          </wp:inline>
+        </w:drawing>
+      </w:r>
+    </w:p>
+    <w:p>
+      <w:r>
+        <w:t xml:space="preserve">And checklist in R </w:t>
+      </w:r>
+      <w:r>
+        <w:rPr>
+          <w:b/>
+          <w:bCs/>
+        </w:rPr>
+        <w:t>here:</w:t>
+      </w:r>
+    </w:p>
+    <w:p>
+      <w:r>
+        <w:rPr>
+          <w:noProof/>
+          <w14:ligatures w14:val="standardContextual"/>
+        </w:rPr>
+        <w:lastRenderedPageBreak/>
+        <w:drawing>
+          <wp:inline distT="0" distB="0" distL="0" distR="0" wp14:anchorId="1120FCA4" wp14:editId="4F874FC7">
+            <wp:extent cx="6400800" cy="4143375"/>
+            <wp:effectExtent l="0" t="0" r="0" b="0"/>
+            <wp:docPr id="1142141326" name="Picture 21"/>
+            <wp:cNvGraphicFramePr>
+              <a:graphicFrameLocks xmlns:a="http://schemas.openxmlformats.org/drawingml/2006/main" noChangeAspect="1"/>
+            </wp:cNvGraphicFramePr>
+            <a:graphic xmlns:a="http://schemas.openxmlformats.org/drawingml/2006/main">
+              <a:graphicData uri="http://schemas.openxmlformats.org/drawingml/2006/picture">
+                <pic:pic xmlns:pic="http://schemas.openxmlformats.org/drawingml/2006/picture">
+                  <pic:nvPicPr>
+                    <pic:cNvPr id="1142141326" name="Picture 1142141326"/>
+                    <pic:cNvPicPr/>
+                  </pic:nvPicPr>
+                  <pic:blipFill>
+                    <a:blip r:embed="rId31" cstate="print">
+                      <a:extLst>
+                        <a:ext uri="{28A0092B-C50C-407E-A947-70E740481C1C}">
+                          <a14:useLocalDpi xmlns:a14="http://schemas.microsoft.com/office/drawing/2010/main" val="0"/>
+                        </a:ext>
+                      </a:extLst>
+                    </a:blip>
+                    <a:stretch>
+                      <a:fillRect/>
+                    </a:stretch>
+                  </pic:blipFill>
+                  <pic:spPr>
+                    <a:xfrm>
+                      <a:off x="0" y="0"/>
+                      <a:ext cx="6400800" cy="4143375"/>
+                    </a:xfrm>
+                    <a:prstGeom prst="rect">
+                      <a:avLst/>
+                    </a:prstGeom>
+                  </pic:spPr>
+                </pic:pic>
+              </a:graphicData>
+            </a:graphic>
+          </wp:inline>
+        </w:drawing>
+      </w:r>
+    </w:p>
     <w:sectPr>
       <w:pgSz w:w="12240" w:h="15840"/>
-      <w:pgMar w:top="1440" w:right="1440" w:bottom="1440" w:left="1440" w:header="720" w:footer="720" w:gutter="0"/>
+      <w:pgMar w:top="1080" w:right="1080" w:bottom="1080" w:left="1080" w:header="720" w:footer="720" w:gutter="0"/>
       <w:cols w:space="720"/>
       <w:docGrid w:linePitch="360"/>
     </w:sectPr>
@@ -1163,7 +2515,7 @@
 </file>
 
 <file path=word/numbering.xml><?xml version="1.0" encoding="utf-8"?>
-<w:numbering xmlns:wpc="http://schemas.microsoft.com/office/word/2010/wordprocessingCanvas" xmlns:cx="http://schemas.microsoft.com/office/drawing/2014/chartex" xmlns:cx1="http://schemas.microsoft.com/office/drawing/2015/9/8/chartex" xmlns:cx2="http://schemas.microsoft.com/office/drawing/2015/10/21/chartex" xmlns:cx3="http://schemas.microsoft.com/office/drawing/2016/5/9/chartex" xmlns:cx4="http://schemas.microsoft.com/office/drawing/2016/5/10/chartex" xmlns:cx5="http://schemas.microsoft.com/office/drawing/2016/5/11/chartex" xmlns:cx6="http://schemas.microsoft.com/office/drawing/2016/5/12/chartex" xmlns:cx7="http://schemas.microsoft.com/office/drawing/2016/5/13/chartex" xmlns:cx8="http://schemas.microsoft.com/office/drawing/2016/5/14/chartex" xmlns:mc="http://schemas.openxmlformats.org/markup-compatibility/2006" xmlns:aink="http://schemas.microsoft.com/office/drawing/2016/ink" xmlns:am3d="http://schemas.microsoft.com/office/drawing/2017/model3d" xmlns:o="urn:schemas-microsoft-com:office:office" xmlns:oel="http://schemas.microsoft.com/office/2019/extlst" xmlns:r="http://schemas.openxmlformats.org/officeDocument/2006/relationships" xmlns:m="http://schemas.openxmlformats.org/officeDocument/2006/math" xmlns:v="urn:schemas-microsoft-com:vml" xmlns:wp14="http://schemas.microsoft.com/office/word/2010/wordprocessingDrawing" xmlns:wp="http://schemas.openxmlformats.org/drawingml/2006/wordprocessingDrawing" xmlns:w10="urn:schemas-microsoft-com:office:word" xmlns:w="http://schemas.openxmlformats.org/wordprocessingml/2006/main" xmlns:w14="http://schemas.microsoft.com/office/word/2010/wordml" xmlns:w15="http://schemas.microsoft.com/office/word/2012/wordml" xmlns:w16cex="http://schemas.microsoft.com/office/word/2018/wordml/cex" xmlns:w16cid="http://schemas.microsoft.com/office/word/2016/wordml/cid" xmlns:w16="http://schemas.microsoft.com/office/word/2018/wordml" xmlns:w16du="http://schemas.microsoft.com/office/word/2023/wordml/word16du" xmlns:w16sdtdh="http://schemas.microsoft.com/office/word/2020/wordml/sdtdatahash" xmlns:w16se="http://schemas.microsoft.com/office/word/2015/wordml/symex" xmlns:wpg="http://schemas.microsoft.com/office/word/2010/wordprocessingGroup" xmlns:wpi="http://schemas.microsoft.com/office/word/2010/wordprocessingInk" xmlns:wne="http://schemas.microsoft.com/office/word/2006/wordml" xmlns:wps="http://schemas.microsoft.com/office/word/2010/wordprocessingShape" mc:Ignorable="w14 w15 w16se w16cid w16 w16cex w16sdtdh w16du wp14">
+<w:numbering xmlns:wpc="http://schemas.microsoft.com/office/word/2010/wordprocessingCanvas" xmlns:cx="http://schemas.microsoft.com/office/drawing/2014/chartex" xmlns:cx1="http://schemas.microsoft.com/office/drawing/2015/9/8/chartex" xmlns:cx2="http://schemas.microsoft.com/office/drawing/2015/10/21/chartex" xmlns:cx3="http://schemas.microsoft.com/office/drawing/2016/5/9/chartex" xmlns:cx4="http://schemas.microsoft.com/office/drawing/2016/5/10/chartex" xmlns:cx5="http://schemas.microsoft.com/office/drawing/2016/5/11/chartex" xmlns:cx6="http://schemas.microsoft.com/office/drawing/2016/5/12/chartex" xmlns:cx7="http://schemas.microsoft.com/office/drawing/2016/5/13/chartex" xmlns:cx8="http://schemas.microsoft.com/office/drawing/2016/5/14/chartex" xmlns:mc="http://schemas.openxmlformats.org/markup-compatibility/2006" xmlns:aink="http://schemas.microsoft.com/office/drawing/2016/ink" xmlns:am3d="http://schemas.microsoft.com/office/drawing/2017/model3d" xmlns:o="urn:schemas-microsoft-com:office:office" xmlns:oel="http://schemas.microsoft.com/office/2019/extlst" xmlns:r="http://schemas.openxmlformats.org/officeDocument/2006/relationships" xmlns:m="http://schemas.openxmlformats.org/officeDocument/2006/math" xmlns:v="urn:schemas-microsoft-com:vml" xmlns:wp14="http://schemas.microsoft.com/office/word/2010/wordprocessingDrawing" xmlns:wp="http://schemas.openxmlformats.org/drawingml/2006/wordprocessingDrawing" xmlns:w10="urn:schemas-microsoft-com:office:word" xmlns:w="http://schemas.openxmlformats.org/wordprocessingml/2006/main" xmlns:w14="http://schemas.microsoft.com/office/word/2010/wordml" xmlns:w15="http://schemas.microsoft.com/office/word/2012/wordml" xmlns:w16cex="http://schemas.microsoft.com/office/word/2018/wordml/cex" xmlns:w16cid="http://schemas.microsoft.com/office/word/2016/wordml/cid" xmlns:w16="http://schemas.microsoft.com/office/word/2018/wordml" xmlns:w16du="http://schemas.microsoft.com/office/word/2023/wordml/word16du" xmlns:w16sdtdh="http://schemas.microsoft.com/office/word/2020/wordml/sdtdatahash" xmlns:w16sdtfl="http://schemas.microsoft.com/office/word/2024/wordml/sdtformatlock" xmlns:w16se="http://schemas.microsoft.com/office/word/2015/wordml/symex" xmlns:wpg="http://schemas.microsoft.com/office/word/2010/wordprocessingGroup" xmlns:wpi="http://schemas.microsoft.com/office/word/2010/wordprocessingInk" xmlns:wne="http://schemas.microsoft.com/office/word/2006/wordml" xmlns:wps="http://schemas.microsoft.com/office/word/2010/wordprocessingShape" mc:Ignorable="w14 w15 w16se w16cid w16 w16cex w16sdtdh w16sdtfl w16du wp14">
   <w:abstractNum w:abstractNumId="0" w15:restartNumberingAfterBreak="0">
     <w:nsid w:val="2D16BA9F"/>
     <w:multiLevelType w:val="hybridMultilevel"/>
@@ -1555,7 +2907,7 @@
 </file>
 
 <file path=word/styles.xml><?xml version="1.0" encoding="utf-8"?>
-<w:styles xmlns:mc="http://schemas.openxmlformats.org/markup-compatibility/2006" xmlns:r="http://schemas.openxmlformats.org/officeDocument/2006/relationships" xmlns:w="http://schemas.openxmlformats.org/wordprocessingml/2006/main" xmlns:w14="http://schemas.microsoft.com/office/word/2010/wordml" xmlns:w15="http://schemas.microsoft.com/office/word/2012/wordml" xmlns:w16cex="http://schemas.microsoft.com/office/word/2018/wordml/cex" xmlns:w16cid="http://schemas.microsoft.com/office/word/2016/wordml/cid" xmlns:w16="http://schemas.microsoft.com/office/word/2018/wordml" xmlns:w16du="http://schemas.microsoft.com/office/word/2023/wordml/word16du" xmlns:w16sdtdh="http://schemas.microsoft.com/office/word/2020/wordml/sdtdatahash" xmlns:w16se="http://schemas.microsoft.com/office/word/2015/wordml/symex" mc:Ignorable="w14 w15 w16se w16cid w16 w16cex w16sdtdh w16du">
+<w:styles xmlns:mc="http://schemas.openxmlformats.org/markup-compatibility/2006" xmlns:r="http://schemas.openxmlformats.org/officeDocument/2006/relationships" xmlns:w="http://schemas.openxmlformats.org/wordprocessingml/2006/main" xmlns:w14="http://schemas.microsoft.com/office/word/2010/wordml" xmlns:w15="http://schemas.microsoft.com/office/word/2012/wordml" xmlns:w16cex="http://schemas.microsoft.com/office/word/2018/wordml/cex" xmlns:w16cid="http://schemas.microsoft.com/office/word/2016/wordml/cid" xmlns:w16="http://schemas.microsoft.com/office/word/2018/wordml" xmlns:w16du="http://schemas.microsoft.com/office/word/2023/wordml/word16du" xmlns:w16sdtdh="http://schemas.microsoft.com/office/word/2020/wordml/sdtdatahash" xmlns:w16sdtfl="http://schemas.microsoft.com/office/word/2024/wordml/sdtformatlock" xmlns:w16se="http://schemas.microsoft.com/office/word/2015/wordml/symex" mc:Ignorable="w14 w15 w16se w16cid w16 w16cex w16sdtdh w16sdtfl w16du">
   <w:docDefaults>
     <w:rPrDefault>
       <w:rPr>
@@ -2519,7 +3871,255 @@
       <w:u w:val="single"/>
     </w:rPr>
   </w:style>
+  <w:style w:type="character" w:customStyle="1" w:styleId="VerbatimChar">
+    <w:name w:val="Verbatim Char"/>
+    <w:basedOn w:val="DefaultParagraphFont"/>
+    <w:link w:val="SourceCode"/>
+    <w:rsid w:val="00A962F6"/>
+    <w:rPr>
+      <w:rFonts w:ascii="Consolas" w:hAnsi="Consolas"/>
+      <w:sz w:val="22"/>
+      <w:shd w:val="clear" w:color="auto" w:fill="F8F8F8"/>
+    </w:rPr>
+  </w:style>
+  <w:style w:type="paragraph" w:customStyle="1" w:styleId="SourceCode">
+    <w:name w:val="Source Code"/>
+    <w:basedOn w:val="Normal"/>
+    <w:link w:val="VerbatimChar"/>
+    <w:rsid w:val="00A962F6"/>
+    <w:pPr>
+      <w:shd w:val="clear" w:color="auto" w:fill="F8F8F8"/>
+      <w:wordWrap w:val="0"/>
+      <w:spacing w:after="200" w:line="240" w:lineRule="auto"/>
+    </w:pPr>
+    <w:rPr>
+      <w:rFonts w:ascii="Consolas" w:hAnsi="Consolas"/>
+      <w:kern w:val="2"/>
+      <w:szCs w:val="24"/>
+      <w14:ligatures w14:val="standardContextual"/>
+    </w:rPr>
+  </w:style>
+  <w:style w:type="character" w:customStyle="1" w:styleId="NormalTok">
+    <w:name w:val="NormalTok"/>
+    <w:basedOn w:val="VerbatimChar"/>
+    <w:rsid w:val="00A962F6"/>
+    <w:rPr>
+      <w:rFonts w:ascii="Consolas" w:hAnsi="Consolas"/>
+      <w:sz w:val="22"/>
+      <w:shd w:val="clear" w:color="auto" w:fill="F8F8F8"/>
+    </w:rPr>
+  </w:style>
+  <w:style w:type="paragraph" w:customStyle="1" w:styleId="p1">
+    <w:name w:val="p1"/>
+    <w:basedOn w:val="Normal"/>
+    <w:rsid w:val="00236455"/>
+    <w:pPr>
+      <w:spacing w:before="100" w:beforeAutospacing="1" w:after="100" w:afterAutospacing="1" w:line="240" w:lineRule="auto"/>
+    </w:pPr>
+    <w:rPr>
+      <w:rFonts w:ascii="Times New Roman" w:eastAsia="Times New Roman" w:hAnsi="Times New Roman" w:cs="Times New Roman"/>
+      <w:sz w:val="24"/>
+      <w:szCs w:val="24"/>
+    </w:rPr>
+  </w:style>
 </w:styles>
+</file>
+
+<file path=word/ink/ink1.xml><?xml version="1.0" encoding="utf-8"?>
+<inkml:ink xmlns:inkml="http://www.w3.org/2003/InkML">
+  <inkml:definitions>
+    <inkml:context xml:id="ctx0">
+      <inkml:inkSource xml:id="inkSrc0">
+        <inkml:traceFormat>
+          <inkml:channel name="X" type="integer" min="-2.14748E9" max="2.14748E9" units="cm"/>
+          <inkml:channel name="Y" type="integer" min="-2.14748E9" max="2.14748E9" units="cm"/>
+          <inkml:channel name="F" type="integer" max="32767" units="dev"/>
+        </inkml:traceFormat>
+        <inkml:channelProperties>
+          <inkml:channelProperty channel="X" name="resolution" value="1000" units="1/cm"/>
+          <inkml:channelProperty channel="Y" name="resolution" value="1000" units="1/cm"/>
+          <inkml:channelProperty channel="F" name="resolution" value="0" units="1/dev"/>
+        </inkml:channelProperties>
+      </inkml:inkSource>
+      <inkml:timestamp xml:id="ts0" timeString="2026-09-29T20:26:11.647"/>
+    </inkml:context>
+    <inkml:brush xml:id="br0">
+      <inkml:brushProperty name="width" value="0.025" units="cm"/>
+      <inkml:brushProperty name="height" value="0.025" units="cm"/>
+      <inkml:brushProperty name="color" value="#E71224"/>
+    </inkml:brush>
+  </inkml:definitions>
+  <inkml:trace contextRef="#ctx0" brushRef="#br0">1505 17 8355,'-47'-5'0,"-11"1"5081,-11 0-5081,-2 1 1397,13 3 0,-2 0-1397,-21 3 848,21 0 0,0 0-848,-4 4 6649,6 3-6649,9 1 0,-2 3 0,4 1 0,-8 4 0,-14 9 0,15-5 0,-11 8 0,24-10 0,2-1 0,-2 0 0,2 0 0,-3 3 0,1 1 0,-27 33 0,33-23 0,-19 27 0,41-32 0,4 0 0,5-1 0,2-6 0,2-1 0,-1-1 0,21 42 0,-5-27 0,21 33 0,-5-38 0,-12-12 0,46 17 0,-29-22 0,50 13 0,-19-20 0,16-3 0,3-2 0,-13 0 0,-7 2 0,0-1-120,12-1 1,15 0 0,-2 0-1,-20-1 120,12-1 0,-33 0 0,0 0 0,0-1 0,0 0 0,1-1 0,0 0 0,4 0 0,-1 0 0,0 0 0,0 0 0,8-3 0,-2-1 478,32-3-478,-6-4 0,-38 4 0,-9-2 0,-1-2 0,-1-3 0,0-2 0,-18 9 0,21-29 0,-27 19 0,19-27 0,-22 15 0,-2-3 0,-4 0 0,-2-8 0,-4 7 0,-9-11 0,-16-15 0,7 22 0,-14-14 0,20 38 0,2 5 0,2 5 0,3 3 0,-11-3 0,-23-9 0,-55-14 0,31 11 0,14 5 0,3 2 0,10 8 0,-5-1 0,7 2 0,8 1 0,10 0 0,4 1 0,-37 0 0,22 1 0,-31-1 0,34 0 0,-2 0 0,3-2 0,-10-1 0,15 2 0,-4-1 0,2 1 0,12 1 0,-5 0 0,11-1 0,3 1 0,0 0 0,-3-1 0,-19-3 0,9 1 0,-18 0 0,16 1 0,-5 1 0,0-1 0,-3 1 0,-1 0 0,-74-3 0,53 3 0,-53-3 0,73 4 0,2 0 0,2 0 0,3 0 0,-1 0 0,-24 2 0,18-1 0,-19 2 0,29-2 0,0 1 0,6-1 0,1-1 0,4 0 0,0 1 0,-6-1 0,7 0 0,-5 1 0,8-1 0,-1 0 0,-1 0 0,-2 0 0,-2-1 0,1-2 0,1 1 0,2-1 0</inkml:trace>
+</inkml:ink>
+</file>
+
+<file path=word/ink/ink2.xml><?xml version="1.0" encoding="utf-8"?>
+<inkml:ink xmlns:inkml="http://www.w3.org/2003/InkML">
+  <inkml:definitions>
+    <inkml:context xml:id="ctx0">
+      <inkml:inkSource xml:id="inkSrc0">
+        <inkml:traceFormat>
+          <inkml:channel name="X" type="integer" min="-2.14748E9" max="2.14748E9" units="cm"/>
+          <inkml:channel name="Y" type="integer" min="-2.14748E9" max="2.14748E9" units="cm"/>
+          <inkml:channel name="F" type="integer" max="32767" units="dev"/>
+        </inkml:traceFormat>
+        <inkml:channelProperties>
+          <inkml:channelProperty channel="X" name="resolution" value="1000" units="1/cm"/>
+          <inkml:channelProperty channel="Y" name="resolution" value="1000" units="1/cm"/>
+          <inkml:channelProperty channel="F" name="resolution" value="0" units="1/dev"/>
+        </inkml:channelProperties>
+      </inkml:inkSource>
+      <inkml:timestamp xml:id="ts0" timeString="2026-09-29T19:57:35.504"/>
+    </inkml:context>
+    <inkml:brush xml:id="br0">
+      <inkml:brushProperty name="width" value="0.35" units="cm"/>
+      <inkml:brushProperty name="height" value="0.35" units="cm"/>
+      <inkml:brushProperty name="color" value="#FFFFFF"/>
+    </inkml:brush>
+  </inkml:definitions>
+  <inkml:trace contextRef="#ctx0" brushRef="#br0">1118 1082 24575,'0'76'0,"1"-1"0,0 21 0,-1-30 0,1-6 0,0-10 0,0-15 0,0-15 0,48-41 0,-13 2 0,43-30 0,-23 17 0,0 2 0,-2 3 0,-4 8 0,-14 6 0,-11 7 0,-19 26 0,-8-2 0,-7 24 0,-1-9 0,-1-3 0,3-6 0,3-12 0,3-6 0,24-18 0,-7 3 0,14-9 0,-15 11 0,-7 4 0,0 1 0,-38 15 0,0-1 0,-42 12 0,3-5 0,0-3 0,15-4 0,3-1 0,1 1 0,-20 6 0,57-12 0,-4 3 0,1-3 0,-2 1 0,0-2 0,0-1 0,-5 2 0,8-1 0,-8 1 0,6-2 0,-10 0 0,2-1 0,3-1 0,9-3 0,7-2 0,-10-12 0,9 8 0,-10-8 0,9 13 0,-5 2 0,-7 0 0,-12 0 0,-7-1 0,1 0 0,-24-7 0,32 2 0,-13-5 0,31 6 0,-1 0 0,-9 1 0,-3 1 0,-3 0 0,-5 2 0,14 0 0,-13-1 0,8 0 0,-5-1 0,-3-1 0,2 1 0,3 0 0,4 1 0,12 0 0,4 2 0,0-1 0,-2 0 0,-9-1 0,3 0 0,2 0 0,8 1 0,20-18 0,-3 8 0,15-14 0,-16 17 0,0 0 0,-5 4 0,6 2 0,8 2 0,12 2 0,12 1 0,9 1 0,4 0 0,1 0 0,-3 0 0,10-3 0,0-1 0,-6 1 0,-1-1 0,-5-1 0,-27-1 0,-1 1 0,-1-1 0,3 0 0,-4-2 0,1-1 0,7-10 0,-13 6 0,20-12 0,-10 8 0,5-2 0,-3 0 0,-12 3 0,-6 1 0,-5 1 0,-15-15 0,-1 11 0,-11-10 0,0 18 0,-4 2 0,-7 2 0,-4 1 0,-5 1 0,8 0 0,-46 4 0,43-2 0,-34 3 0,41 0 0,-5 0 0,1 1 0,0-3 0,11 1 0,7-2 0,2-1 0,8-1 0,-11 1 0,0-1 0,-14 0 0,-1 0 0,0 0 0,-19 0 0,27 0 0,-13 0 0,29 0 0,-1 1 0,-3 0 0,0 0 0,1 1 0,3-1 0,-6 1 0,3 0 0,-9 1 0,2 0 0,-2-1 0,3-1 0,5 0 0,1 0 0,0 0 0,-14 0 0,14 0 0,-6 0 0,39-17 0,-8 5 0,21-17 0,-13 7 0,0-2 0,-5 0 0,-2 1 0,-5 1 0,-1 0 0,-3-51 0,-4 33 0,-2-39 0,-3 45 0,1 3 0,-1 2 0,3 1 0,0 0 0,2-50-984,1 33 0,-1-27 0,0 49 0,-1 11 0,0-1 0,1-1 104,-1-1 880,-1 5 983,2-18 0,-2 13 0,2-14 0,-3 11 0,0-1 0,0-3-97,0 0-886,0-1 0,0 0 0,1-4 0,0-1 0,0-1 0,2 3 0,0 2 0,0 3 0,0 4 0,3-6 0,-4 12 0,2-4 0,1 10 0,2 1 0,8-3 0,8 0 0,62-21 0,-37 13 0,37-14 0,-59 18 0,-7 2 0,1 0 0,1 1 0,-2 1 0,3-1 0,61-5 0,-44 7 0,49-4 0,-66 8 0,0 1 0,-6 1 0,-1-1 0,-2 2 0,1 0 0,46 16 0,-20-4 0,22 10 0,-38-13 0,-16-4 0,-3 1 0,2 5 0,2 5 0,1 0 0,8 31 0,-11-24 0,4 25 0,-10-31 0,-1 1 0,-1-3 0,-2 2 0,-3 0 0,-3 3 0,-14 30 0,11-25 0,-9 18 0,12-29 0,-2 0 0,-5 3 0,0 1 0,-3-2 0,0-1 0,-41 16 0,23-14 0,-35 11 0,35-21 0,-2-2 0,-1-4 0,0-1 0,3-2 0,-1-1 0,2-19 0,14 5 0,5-17 0,22 7 0,7-3 0,7-4 0,7-3 0,5 2 0,35-24 0,-35 32 0,20-11 0,-48 33 0,2 3 0,8 11 0,-5-4 0,10 10 0,-10-8 0,2 1 0,0 0 0,-2-2 0,3 1 0,-1-3 0,35 20 0,-20-13 0,24 15 0,-33-19 0,-5-2 0,-5-1 0,-3 2 0,1 1 0,3 9 0,16 44 0,-6-24 0,9 27 0,-18-45 0,-2-9 0,-5-7 0,-74 27 0,37-21 0,-11 6 0,-1-1 0,11-9 0,2-1 0,8-1 0,4-1 0,8-2 0,-2 2 0,-12 1 0,11-2 0,-9 4 0,17-2 0,-1 0 0,2 0 0,-1 0 0,2-1 0,-3 1 0,-4 3 0,7-4 0,-4 2 0,9-5 0</inkml:trace>
+  <inkml:trace contextRef="#ctx0" brushRef="#br0" timeOffset="2218">1 356 24575,'59'-9'0,"28"3"0,-31 6 0,3 2 0,8 0 0,2 0 0,3 0 0,-1 0 0,-10-1 0,-4 1 0,22 0 0,-35-1 0,-34-1 0,-7 0 0,11 1 0,-5 0 0,13 0 0,9 0 0,-18-1 0,11 0 0,-38-20 0,11 14 0,-10-14 0</inkml:trace>
+</inkml:ink>
+</file>
+
+<file path=word/ink/ink3.xml><?xml version="1.0" encoding="utf-8"?>
+<inkml:ink xmlns:inkml="http://www.w3.org/2003/InkML">
+  <inkml:definitions>
+    <inkml:context xml:id="ctx0">
+      <inkml:inkSource xml:id="inkSrc0">
+        <inkml:traceFormat>
+          <inkml:channel name="X" type="integer" min="-2.14748E9" max="2.14748E9" units="cm"/>
+          <inkml:channel name="Y" type="integer" min="-2.14748E9" max="2.14748E9" units="cm"/>
+          <inkml:channel name="F" type="integer" max="32767" units="dev"/>
+        </inkml:traceFormat>
+        <inkml:channelProperties>
+          <inkml:channelProperty channel="X" name="resolution" value="1000" units="1/cm"/>
+          <inkml:channelProperty channel="Y" name="resolution" value="1000" units="1/cm"/>
+          <inkml:channelProperty channel="F" name="resolution" value="0" units="1/dev"/>
+        </inkml:channelProperties>
+      </inkml:inkSource>
+      <inkml:timestamp xml:id="ts0" timeString="2026-09-29T20:26:16.751"/>
+    </inkml:context>
+    <inkml:brush xml:id="br0">
+      <inkml:brushProperty name="width" value="0.025" units="cm"/>
+      <inkml:brushProperty name="height" value="0.025" units="cm"/>
+      <inkml:brushProperty name="color" value="#E71224"/>
+    </inkml:brush>
+  </inkml:definitions>
+  <inkml:trace contextRef="#ctx0" brushRef="#br0">2130 103 14450,'-19'1'0,"-11"0"4208,-16 1-4208,-27-1 1753,-25 0-1753,25 4 0,-12 3 0,6-1 0,0-1 0,0 1 0,-1 1 0,-6 2 0,13-1 0,-17 2 477,22-3 0,0 1-477,-18 1 1605,19-2 0,0 0-1605,-7 2 0,3-1 0,-18 9 0,19-3 0,-21 8 0,36-7 0,10 2 0,3 0 0,9 0 0,-1 0 0,-29 38 0,33-28 0,-24 30 0,41-37 0,5-1 0,1 1 0,4 0 0,2 3 0,2 5 0,47 40 0,-15-32 0,42 26 0,-40-48 0,48 4 0,-32-12 0,3-2 0,5 2 0,1-1 0,1-2 0,4-1 0,0-2 0,5-1 0,-5 0 0,-6 0 0,1 0 0,6-1 0,5 1 0,-7-1 0,33 0 0,2 0 0,-47 0 0,2 0 0,8 0 0,1 0 0,-6 0 0,0 0 0,5 1 0,4-1 0,8-1 0,7-2 0,-8 2 0,-15-1 0,-1 1 0,43-4 0,-10-1 0,-43-2 0,-6-3 0,25-3 0,18-5 0,-29 9 0,3-2 0,2 1 0,3-2 0,15-9 0,-3-2 0,13-7 0,-37 8 0,-8-2 0,-22-4 0,-10-1 0,-9 2 0,-5-3 0,-3 5 0,-4-7 0,-33-19 0,-8-1 0,2-2 0,-9-2 0,0 3 0,8 19 0,-11-2 0,-11-1 0,22 13 0,5 5 0,36 18 0,-8 0 0,7 3 0,-9-1 0,4 1 0,3 0 0,-5 0 0,0 1 0,-5 0 0,-2 0 0,-21 1 0,19-1 0,-13 2 0,24-2 0,3 2 0,3-1 0,-2 1 0,-1 1 0,-7 0 0,-37 8 0,23-5 0,-23 3 0,43-7 0,4-2 0,5 0 0,0-1 0,-3 1 0,-11 3 0,10-2 0,-9 8 0,16-8 0,-1 5 0</inkml:trace>
+</inkml:ink>
+</file>
+
+<file path=word/ink/ink4.xml><?xml version="1.0" encoding="utf-8"?>
+<inkml:ink xmlns:inkml="http://www.w3.org/2003/InkML">
+  <inkml:definitions>
+    <inkml:context xml:id="ctx0">
+      <inkml:inkSource xml:id="inkSrc0">
+        <inkml:traceFormat>
+          <inkml:channel name="X" type="integer" min="-2.14748E9" max="2.14748E9" units="cm"/>
+          <inkml:channel name="Y" type="integer" min="-2.14748E9" max="2.14748E9" units="cm"/>
+          <inkml:channel name="F" type="integer" max="32767" units="dev"/>
+        </inkml:traceFormat>
+        <inkml:channelProperties>
+          <inkml:channelProperty channel="X" name="resolution" value="1000" units="1/cm"/>
+          <inkml:channelProperty channel="Y" name="resolution" value="1000" units="1/cm"/>
+          <inkml:channelProperty channel="F" name="resolution" value="0" units="1/dev"/>
+        </inkml:channelProperties>
+      </inkml:inkSource>
+      <inkml:timestamp xml:id="ts0" timeString="2026-09-29T20:09:09.534"/>
+    </inkml:context>
+    <inkml:brush xml:id="br0">
+      <inkml:brushProperty name="width" value="0.05" units="cm"/>
+      <inkml:brushProperty name="height" value="0.05" units="cm"/>
+      <inkml:brushProperty name="color" value="#E71224"/>
+    </inkml:brush>
+  </inkml:definitions>
+  <inkml:trace contextRef="#ctx0" brushRef="#br0">2561 1 15671,'-15'16'0,"-1"4"3821,-4 8-3821,-3 5 1536,-2 3-1536,-7 10 825,-3 2-825,-7 11 2722,1-4-2722,6-12 0,0 0 0,-7 5 0,-22 23 0,31-38 0,-2-3 0,-6 4 0,-3 1 0,-7 5 0,-1 2 0,-12 1 0,-2 0 0,-3 6 0,7-10 0,3-3 0,22-9 0,0-3 0,4-4 0,-4 2 0,-1-3 0,-3-1 0,-27 5 0,-22 6 0,9-4 0,26-7 0,-1 0 0,-28 9 0,-13 3 0,17-4 0,0 3 0,10-2 0,14-6 0,18-7 0,10-6 0,-18-1 0,19-2 0,-18 1 0,23-3 0,-2 1 0,-4-1 0,0 0 0,4-1 0,-12 2 0,18-2 0,-8 2 0,16-3 0,-3 0 0,1 0 0,-5 1 0,4-2 0,2 1 0,1-1 0,13-6 0,0 0 0,13-7 0,-1 2 0,2-3 0,1 1 0,0-2 0,-2 2 0,-1 0 0,12-13 0,-12 12 0,8-9 0,-17 18 0,-3 2 0,1-1 0,-1-1 0,1 1 0,-1 0 0,5-6 0,-2 3 0,3-3 0,-2 3 0,1 2 0,1-1 0,1 0 0,-2 2 0,-3 2 0,-3 0 0,-2 3 0,-2 2 0,-5 2 0,-45 34 0,23-18 0,-32 22 0,40-27 0,4-1 0,3-3 0,2-2 0,3-3 0,-16 15 0,14-12 0,-11 11 0,18-17 0,1 0 0,0 0 0,-3 3 0,1-1 0,-4 13 0,5-11 0,-3 7 0,6-12 0,1-1 0,3-2 0,4 3 0,8 2 0,7 2 0,11 4 0,16 2 0,2 1 0,1-1 0,41 11 0,-75-21 0,-5-1 0,1 1 0,6 1 0,7 1 0,3 2 0,33 10 0,-23-6 0,22 6 0,-31-9 0,-3-1 0,-6-2 0,-10-3 0,-5 0 0,-7-2 0,2-1 0,-2-1 0,0 1 0,-2-1 0,2 1 0,-1 1 0,1-2 0</inkml:trace>
+</inkml:ink>
+</file>
+
+<file path=word/ink/ink5.xml><?xml version="1.0" encoding="utf-8"?>
+<inkml:ink xmlns:inkml="http://www.w3.org/2003/InkML">
+  <inkml:definitions>
+    <inkml:context xml:id="ctx0">
+      <inkml:inkSource xml:id="inkSrc0">
+        <inkml:traceFormat>
+          <inkml:channel name="X" type="integer" min="-2.14748E9" max="2.14748E9" units="cm"/>
+          <inkml:channel name="Y" type="integer" min="-2.14748E9" max="2.14748E9" units="cm"/>
+          <inkml:channel name="F" type="integer" max="32767" units="dev"/>
+        </inkml:traceFormat>
+        <inkml:channelProperties>
+          <inkml:channelProperty channel="X" name="resolution" value="1000" units="1/cm"/>
+          <inkml:channelProperty channel="Y" name="resolution" value="1000" units="1/cm"/>
+          <inkml:channelProperty channel="F" name="resolution" value="0" units="1/dev"/>
+        </inkml:channelProperties>
+      </inkml:inkSource>
+      <inkml:timestamp xml:id="ts0" timeString="2026-09-29T20:26:26.911"/>
+    </inkml:context>
+    <inkml:brush xml:id="br0">
+      <inkml:brushProperty name="width" value="0.025" units="cm"/>
+      <inkml:brushProperty name="height" value="0.025" units="cm"/>
+      <inkml:brushProperty name="color" value="#E71224"/>
+    </inkml:brush>
+  </inkml:definitions>
+  <inkml:trace contextRef="#ctx0" brushRef="#br0">1528 25 24575,'-9'-1'0,"-12"-1"0,-8 0 0,-66-6 0,35 5 0,8 0 0,1 0 0,-3 3 0,2 0 0,3 0 0,-7-1 0,9 0 0,-13 0 0,-7 2 0,-1 1 0,-3 0 0,5 0 0,7 1 0,31-1 0,-2 1 0,4 1 0,-9 0 0,2 1 0,-53 19 0,36-9 0,-35 13 0,56-14 0,8 0 0,5 4 0,4 3 0,1 3 0,-17 23 0,12-15 0,-12 16 0,17-20 0,2-2 0,5-3 0,1 0 0,3 0 0,14 37 0,-4-30 0,14 24 0,-7-37 0,4-3 0,3-2 0,6 1 0,9-3 0,25-1 0,6-2 0,12 1 0,-6-2 0,-1-2 0,-3-3 0,1-1 0,2-1 0,0-3 0,-1-1 0,-5-3 0,0-6 0,1-2 0,6-3 0,-12 2 0,-3-1 0,-11-1 0,-6 1 0,-2-4 0,-5 1 0,1-8 0,-4 0 0,10-52 0,-23 35 0,0-29 0,-21 50 0,0 5 0,0 4 0,-1 3 0,-1 1 0,-1 0 0,-12-15 0,6 12 0,-7-9 0,8 17 0,2 2 0,-4-2 0,-3 0 0,-3 0 0,1 1 0,-15-3 0,15 4 0,-10 0 0,19 4 0,4 0 0,0 1 0,1 0 0,-2 0 0,1 0 0,-1 0 0,2 0 0,1 0 0</inkml:trace>
+</inkml:ink>
+</file>
+
+<file path=word/ink/ink6.xml><?xml version="1.0" encoding="utf-8"?>
+<inkml:ink xmlns:inkml="http://www.w3.org/2003/InkML">
+  <inkml:definitions>
+    <inkml:context xml:id="ctx0">
+      <inkml:inkSource xml:id="inkSrc0">
+        <inkml:traceFormat>
+          <inkml:channel name="X" type="integer" min="-2.14748E9" max="2.14748E9" units="cm"/>
+          <inkml:channel name="Y" type="integer" min="-2.14748E9" max="2.14748E9" units="cm"/>
+          <inkml:channel name="F" type="integer" max="32767" units="dev"/>
+        </inkml:traceFormat>
+        <inkml:channelProperties>
+          <inkml:channelProperty channel="X" name="resolution" value="1000" units="1/cm"/>
+          <inkml:channelProperty channel="Y" name="resolution" value="1000" units="1/cm"/>
+          <inkml:channelProperty channel="F" name="resolution" value="0" units="1/dev"/>
+        </inkml:channelProperties>
+      </inkml:inkSource>
+      <inkml:timestamp xml:id="ts0" timeString="2026-09-29T20:12:31.916"/>
+    </inkml:context>
+    <inkml:brush xml:id="br0">
+      <inkml:brushProperty name="width" value="0.025" units="cm"/>
+      <inkml:brushProperty name="height" value="0.025" units="cm"/>
+      <inkml:brushProperty name="color" value="#E71224"/>
+    </inkml:brush>
+  </inkml:definitions>
+  <inkml:trace contextRef="#ctx0" brushRef="#br0">0 0 24575,'0'11'0,"1"0"0,1 8 0,3 5 0,4 6 0,3 5 0,2 0 0,26 34 0,-15-26 0,20 26 0,-23-38 0,-3-3 0,-1-3 0,-1 0 0,9 5 0,-2-3 0,43 33 0,-34-32 0,28 23 0,-38-34 0,7 1 0,12 6 0,13 2 0,15 4 0,8 1 0,3 0 0,5 2 0,-9-4 0,-4-2 0,-25-8 0,-2-1 0,-6-3 0,-4-1 0,0 0 0,-4-2 0,23 7 0,-24-8 0,17 4 0,-27-10 0,0-1 0,5 3 0,12 1 0,15 6 0,2-4 0,14 1 0,-36-6 0,1-2 0,-27-4 0,8 0 0,12 0 0,3 1 0,1-2 0,20-6 0,-27 4 0,22-5 0,-23 7 0,5 0 0,3 2 0,-5 0 0,-5 0 0,-8 0 0,-6 0 0,11 0 0,-11 0 0,9 0 0,-12 0 0,-4 0 0,-6-3 0,-3 0 0,-9-4 0,-6-1 0,-6-3 0,-48-21 0,40 16 0,-25-11 0,57 24 0,3 2 0,2 1 0,0-1 0,1-1 0,0 1 0,-3-3 0,-2 0 0,-1-1 0,-1 0 0,1 1 0,-6-3 0,3 2 0,-7-3 0,5 1 0,-2-1 0,-1 1 0,3 2 0,-1 1 0,5 2 0,0 0 0,1 1 0,-1-1 0,-1 1 0,1 0 0,3 0 0,22 6 0,-3-1 0,15 4 0,-12-2 0,-3-1 0,-2-2 0,-2 0 0,-2-1 0,0 0 0,5 3 0,-8-3 0,5 2 0,-8-3 0,2 1 0,3 2 0,2 1 0,-1 1 0,2 0 0,7 5 0,-5-3 0,5 2 0,-8-3 0,-3-1 0,2 1 0,2 1 0,0 0 0,20 9 0,-19-11 0,14 6 0,-25-12 0,2 1 0,1 1 0,2 1 0,1 1 0,-1 0 0,-3-1 0,0-1 0,-2-1 0,0 1 0,-1-1 0,1 1 0,-1-1 0,0 0 0,-3 6 0,1-3 0,-4 5 0,2-4 0,0 1 0,-2 1 0,2-2 0,-1 2 0,-8 13 0,5-9 0,-6 9 0,9-14 0,1-1 0,0-1 0,-1 1 0,0 0 0,-13 14 0,7-7 0,-9 11 0,12-14 0,1-1 0,-1 0 0,0-1 0,0-1 0,0 0 0,-11 8 0,9-7 0,-8 6 0,11-8 0,0 0 0,0 0 0,0 0 0,-1 1 0,0 1 0,-13 9 0,10-6 0,-8 6 0,14-12 0,0-1 0,-1 1 0,-1 1 0,-2 1 0,1 0 0,2-2 0,2-2 0,4-1 0,0-1 0,0-4 0,1-2 0,-2-5 0,1 1 0,-1 3 0,1 4 0</inkml:trace>
+</inkml:ink>
+</file>
+
+<file path=word/ink/ink7.xml><?xml version="1.0" encoding="utf-8"?>
+<inkml:ink xmlns:inkml="http://www.w3.org/2003/InkML">
+  <inkml:definitions>
+    <inkml:context xml:id="ctx0">
+      <inkml:inkSource xml:id="inkSrc0">
+        <inkml:traceFormat>
+          <inkml:channel name="X" type="integer" min="-2.14748E9" max="2.14748E9" units="cm"/>
+          <inkml:channel name="Y" type="integer" min="-2.14748E9" max="2.14748E9" units="cm"/>
+          <inkml:channel name="F" type="integer" max="32767" units="dev"/>
+        </inkml:traceFormat>
+        <inkml:channelProperties>
+          <inkml:channelProperty channel="X" name="resolution" value="1000" units="1/cm"/>
+          <inkml:channelProperty channel="Y" name="resolution" value="1000" units="1/cm"/>
+          <inkml:channelProperty channel="F" name="resolution" value="0" units="1/dev"/>
+        </inkml:channelProperties>
+      </inkml:inkSource>
+      <inkml:timestamp xml:id="ts0" timeString="2026-09-29T20:26:40.287"/>
+    </inkml:context>
+    <inkml:brush xml:id="br0">
+      <inkml:brushProperty name="width" value="0.025" units="cm"/>
+      <inkml:brushProperty name="height" value="0.025" units="cm"/>
+      <inkml:brushProperty name="color" value="#E71224"/>
+    </inkml:brush>
+  </inkml:definitions>
+  <inkml:trace contextRef="#ctx0" brushRef="#br0">700 7 24335,'-5'-1'0,"-3"-1"120,4 1-120,-6 0 40,2 1-40,-44-2 20,22 2-20,-36 1 60,29 2-60,-3 3 0,-5 2 0,-6 2 0,2 1 0,5 2 0,-3 6 0,13-2 0,-9 6 0,11-4 0,6-1 0,5 0 0,6-1 0,0 2 0,4-1 0,4 53 0,14-34 0,8 41 0,13-50 0,10-2 0,8-4 0,13-1 0,2-3 0,31-9 0,3-4 0,-9-1 0,8-2 0,-7-2 0,-37-7 0,4 3 0,-6-3 0,-9 2 0,-5-2 0,-10-3 0,7-13 0,-11 5 0,4-8 0,-12 9 0,-4 3 0,1-1 0,0-2 0,2-4 0,-1-33 0,-6 20 0,-3-17 0,-7 32 0,0 6 0,-3 0 0,-1-1 0,-1 3 0,3 3 0,-18-9 0,-1 3 0,-25-12 0,5 6 0,4 4 0,15 6 0,7 5 0,8 2 0,-55-5 0,42 5 0,-34-4 0,52 7 0,3 0 0,-2 0 0,1-1 0,1 1 0,2-1 0,2 1 0,-1 0 0,1 0 0,1 0 0</inkml:trace>
+</inkml:ink>
 </file>
 
 <file path=word/theme/theme1.xml><?xml version="1.0" encoding="utf-8"?>

</xml_diff>